<commit_message>
docs: refresh exported PRD
</commit_message>
<xml_diff>
--- a/Crawfish-PRD.docx
+++ b/Crawfish-PRD.docx
@@ -199,7 +199,49 @@
           <w:spacing w:val="0"/>
           <w:color w:val="181F26"/>
         </w:rPr>
-        <w:t xml:space="preserve">This repository is currently documentation-first. The Markdown files in </w:t>
+        <w:t xml:space="preserve">This repository is now </w:t>
+      </w:r>
+      <w:r>
+        <w:rPr>
+          <w:rFonts w:ascii="Helvetica Neue" w:hAnsi="Helvetica Neue" w:cs="Helvetica Neue"/>
+          <w:sz w:val="24"/>
+          <w:sz-cs w:val="24"/>
+          <w:b/>
+          <w:spacing w:val="0"/>
+          <w:color w:val="181F26"/>
+        </w:rPr>
+        <w:t xml:space="preserve">Rust-first for implementation</w:t>
+      </w:r>
+      <w:r>
+        <w:rPr>
+          <w:rFonts w:ascii="Helvetica Neue" w:hAnsi="Helvetica Neue" w:cs="Helvetica Neue"/>
+          <w:sz w:val="24"/>
+          <w:sz-cs w:val="24"/>
+          <w:spacing w:val="0"/>
+          <w:color w:val="181F26"/>
+        </w:rPr>
+        <w:t xml:space="preserve"> and </w:t>
+      </w:r>
+      <w:r>
+        <w:rPr>
+          <w:rFonts w:ascii="Helvetica Neue" w:hAnsi="Helvetica Neue" w:cs="Helvetica Neue"/>
+          <w:sz w:val="24"/>
+          <w:sz-cs w:val="24"/>
+          <w:b/>
+          <w:spacing w:val="0"/>
+          <w:color w:val="181F26"/>
+        </w:rPr>
+        <w:t xml:space="preserve">Markdown-first for product and architecture specs</w:t>
+      </w:r>
+      <w:r>
+        <w:rPr>
+          <w:rFonts w:ascii="Helvetica Neue" w:hAnsi="Helvetica Neue" w:cs="Helvetica Neue"/>
+          <w:sz w:val="24"/>
+          <w:sz-cs w:val="24"/>
+          <w:spacing w:val="0"/>
+          <w:color w:val="181F26"/>
+        </w:rPr>
+        <w:t xml:space="preserve">. The Markdown files in </w:t>
       </w:r>
       <w:r>
         <w:rPr>
@@ -220,7 +262,28 @@
           <w:spacing w:val="0"/>
           <w:color w:val="181F26"/>
         </w:rPr>
-        <w:t xml:space="preserve"> are the source of truth. The existing DOCX and HTML files are retained as legacy exports and reference material, not as the primary editable spec.</w:t>
+        <w:t xml:space="preserve"> remain the design source of truth. The Cargo workspace under </w:t>
+      </w:r>
+      <w:r>
+        <w:rPr>
+          <w:rFonts w:ascii="Menlo" w:hAnsi="Menlo" w:cs="Menlo"/>
+          <w:sz w:val="24"/>
+          <w:sz-cs w:val="24"/>
+          <w:u w:val="single"/>
+          <w:spacing w:val="0"/>
+          <w:color w:val="0000E9"/>
+        </w:rPr>
+        <w:t xml:space="preserve">crates/</w:t>
+      </w:r>
+      <w:r>
+        <w:rPr>
+          <w:rFonts w:ascii="Helvetica Neue" w:hAnsi="Helvetica Neue" w:cs="Helvetica Neue"/>
+          <w:sz w:val="24"/>
+          <w:sz-cs w:val="24"/>
+          <w:spacing w:val="0"/>
+          <w:color w:val="181F26"/>
+        </w:rPr>
+        <w:t xml:space="preserve"> is the implementation source of truth. The existing DOCX and HTML files are retained as legacy exports and reference material.</w:t>
       </w:r>
     </w:p>
     <w:p>
@@ -246,6 +309,41 @@
           <w:color w:val="181F26"/>
         </w:rPr>
         <w:t xml:space="preserve">python3 scripts/export_docset.py</w:t>
+      </w:r>
+      <w:r>
+        <w:rPr>
+          <w:rFonts w:ascii="Helvetica Neue" w:hAnsi="Helvetica Neue" w:cs="Helvetica Neue"/>
+          <w:sz w:val="24"/>
+          <w:sz-cs w:val="24"/>
+          <w:spacing w:val="0"/>
+          <w:color w:val="181F26"/>
+        </w:rPr>
+        <w:t xml:space="preserve">.</w:t>
+      </w:r>
+    </w:p>
+    <w:p>
+      <w:pPr>
+        <w:spacing w:after="240"/>
+      </w:pPr>
+      <w:r>
+        <w:rPr>
+          <w:rFonts w:ascii="Helvetica Neue" w:hAnsi="Helvetica Neue" w:cs="Helvetica Neue"/>
+          <w:sz w:val="24"/>
+          <w:sz-cs w:val="24"/>
+          <w:spacing w:val="0"/>
+          <w:color w:val="181F26"/>
+        </w:rPr>
+        <w:t xml:space="preserve">To compile and test the Rust workspace, run </w:t>
+      </w:r>
+      <w:r>
+        <w:rPr>
+          <w:rFonts w:ascii="Menlo" w:hAnsi="Menlo" w:cs="Menlo"/>
+          <w:sz w:val="24"/>
+          <w:sz-cs w:val="24"/>
+          <w:spacing w:val="0"/>
+          <w:color w:val="181F26"/>
+        </w:rPr>
+        <w:t xml:space="preserve">cargo test --workspace</w:t>
       </w:r>
       <w:r>
         <w:rPr>
@@ -2814,6 +2912,86 @@
       </w:r>
     </w:p>
     <w:p>
+      <w:pPr>
+        <w:spacing w:after="240"/>
+      </w:pPr>
+      <w:r>
+        <w:rPr>
+          <w:rFonts w:ascii="Helvetica Neue" w:hAnsi="Helvetica Neue" w:cs="Helvetica Neue"/>
+          <w:sz w:val="24"/>
+          <w:sz-cs w:val="24"/>
+          <w:spacing w:val="0"/>
+          <w:color w:val="181F26"/>
+        </w:rPr>
+        <w:t xml:space="preserve">Then use the Rust workspace:</w:t>
+      </w:r>
+    </w:p>
+    <w:p>
+      <w:pPr/>
+      <w:r>
+        <w:rPr>
+          <w:rFonts w:ascii="Menlo" w:hAnsi="Menlo" w:cs="Menlo"/>
+          <w:sz w:val="24"/>
+          <w:sz-cs w:val="24"/>
+          <w:spacing w:val="0"/>
+          <w:color w:val="DFE8F2"/>
+        </w:rPr>
+        <w:t xml:space="preserve">cargo test --workspace</w:t>
+      </w:r>
+    </w:p>
+    <w:p>
+      <w:pPr/>
+      <w:r>
+        <w:rPr>
+          <w:rFonts w:ascii="Menlo" w:hAnsi="Menlo" w:cs="Menlo"/>
+          <w:sz w:val="24"/>
+          <w:sz-cs w:val="24"/>
+          <w:spacing w:val="0"/>
+          <w:color w:val="DFE8F2"/>
+        </w:rPr>
+        <w:t xml:space="preserve">cargo run -p crawfish-cli --bin crawfish -- init ./sandbox</w:t>
+      </w:r>
+    </w:p>
+    <w:p>
+      <w:pPr/>
+      <w:r>
+        <w:rPr>
+          <w:rFonts w:ascii="Menlo" w:hAnsi="Menlo" w:cs="Menlo"/>
+          <w:sz w:val="24"/>
+          <w:sz-cs w:val="24"/>
+          <w:spacing w:val="0"/>
+          <w:color w:val="DFE8F2"/>
+        </w:rPr>
+        <w:t xml:space="preserve">cd sandbox</w:t>
+      </w:r>
+    </w:p>
+    <w:p>
+      <w:pPr/>
+      <w:r>
+        <w:rPr>
+          <w:rFonts w:ascii="Menlo" w:hAnsi="Menlo" w:cs="Menlo"/>
+          <w:sz w:val="24"/>
+          <w:sz-cs w:val="24"/>
+          <w:spacing w:val="0"/>
+          <w:color w:val="DFE8F2"/>
+        </w:rPr>
+        <w:t xml:space="preserve">cargo run -p crawfish-cli --bin crawfish -- run --once</w:t>
+      </w:r>
+    </w:p>
+    <w:p>
+      <w:pPr/>
+      <w:r>
+        <w:rPr>
+          <w:rFonts w:ascii="Menlo" w:hAnsi="Menlo" w:cs="Menlo"/>
+          <w:sz w:val="24"/>
+          <w:sz-cs w:val="24"/>
+          <w:spacing w:val="0"/>
+          <w:color w:val="DFE8F2"/>
+        </w:rPr>
+        <w:t xml:space="preserve">cargo run -p crawfish-cli --bin crawfish -- status --json</w:t>
+      </w:r>
+    </w:p>
+    <w:p>
       <w:pPr/>
       <w:r>
         <w:rPr>
@@ -10718,35 +10896,35 @@
           <w:spacing w:val="0"/>
           <w:color w:val="181F26"/>
         </w:rPr>
-        <w:t xml:space="preserve">TypeScript-first runtime with Node 22+ compatibility.</w:t>
-      </w:r>
-    </w:p>
-    <w:p>
-      <w:pPr>
-        <w:ind w:left="720" w:first-line="-720"/>
-      </w:pPr>
-      <w:r>
-        <w:rPr>
-          <w:rFonts w:ascii="Helvetica Neue" w:hAnsi="Helvetica Neue" w:cs="Helvetica Neue"/>
-          <w:sz w:val="24"/>
-          <w:sz-cs w:val="24"/>
-          <w:color w:val="181F26"/>
-        </w:rPr>
-        <w:t xml:space="preserve"/>
-        <w:tab/>
-        <w:t xml:space="preserve">•</w:t>
-        <w:tab/>
-        <w:t xml:space="preserve"/>
-      </w:r>
-      <w:r>
-        <w:rPr>
-          <w:rFonts w:ascii="Helvetica Neue" w:hAnsi="Helvetica Neue" w:cs="Helvetica Neue"/>
-          <w:sz w:val="24"/>
-          <w:sz-cs w:val="24"/>
-          <w:spacing w:val="0"/>
-          <w:color w:val="181F26"/>
-        </w:rPr>
-        <w:t xml:space="preserve">Bun may be supported, but it is not a prerequisite.</w:t>
+        <w:t xml:space="preserve">Rust-first runtime with Rust 1.88+ compatibility.</w:t>
+      </w:r>
+    </w:p>
+    <w:p>
+      <w:pPr>
+        <w:ind w:left="720" w:first-line="-720"/>
+      </w:pPr>
+      <w:r>
+        <w:rPr>
+          <w:rFonts w:ascii="Helvetica Neue" w:hAnsi="Helvetica Neue" w:cs="Helvetica Neue"/>
+          <w:sz w:val="24"/>
+          <w:sz-cs w:val="24"/>
+          <w:color w:val="181F26"/>
+        </w:rPr>
+        <w:t xml:space="preserve"/>
+        <w:tab/>
+        <w:t xml:space="preserve">•</w:t>
+        <w:tab/>
+        <w:t xml:space="preserve"/>
+      </w:r>
+      <w:r>
+        <w:rPr>
+          <w:rFonts w:ascii="Helvetica Neue" w:hAnsi="Helvetica Neue" w:cs="Helvetica Neue"/>
+          <w:sz w:val="24"/>
+          <w:sz-cs w:val="24"/>
+          <w:spacing w:val="0"/>
+          <w:color w:val="181F26"/>
+        </w:rPr>
+        <w:t xml:space="preserve">External protocol adapters may be implemented out of process in other languages, but the core runtime, CLI, state machine logic, and persistence layer are Rust-owned.</w:t>
       </w:r>
     </w:p>
     <w:p>
@@ -11844,1593 +12022,1593 @@
           <w:spacing w:val="0"/>
           <w:color w:val="DFE8F2"/>
         </w:rPr>
-        <w:t xml:space="preserve">export type OwnerRef = {</w:t>
-      </w:r>
-    </w:p>
-    <w:p>
-      <w:pPr/>
-      <w:r>
-        <w:rPr>
-          <w:rFonts w:ascii="Menlo" w:hAnsi="Menlo" w:cs="Menlo"/>
-          <w:sz w:val="24"/>
-          <w:sz-cs w:val="24"/>
-          <w:spacing w:val="0"/>
-          <w:color w:val="DFE8F2"/>
-        </w:rPr>
-        <w:t xml:space="preserve">  kind: "human" | "team" | "org" | "service_account";</w:t>
-      </w:r>
-    </w:p>
-    <w:p>
-      <w:pPr/>
-      <w:r>
-        <w:rPr>
-          <w:rFonts w:ascii="Menlo" w:hAnsi="Menlo" w:cs="Menlo"/>
-          <w:sz w:val="24"/>
-          <w:sz-cs w:val="24"/>
-          <w:spacing w:val="0"/>
-          <w:color w:val="DFE8F2"/>
-        </w:rPr>
-        <w:t xml:space="preserve">  id: string;</w:t>
-      </w:r>
-    </w:p>
-    <w:p>
-      <w:pPr/>
-      <w:r>
-        <w:rPr>
-          <w:rFonts w:ascii="Menlo" w:hAnsi="Menlo" w:cs="Menlo"/>
-          <w:sz w:val="24"/>
-          <w:sz-cs w:val="24"/>
-          <w:spacing w:val="0"/>
-          <w:color w:val="DFE8F2"/>
-        </w:rPr>
-        <w:t xml:space="preserve">  display_name?: string;</w:t>
-      </w:r>
-    </w:p>
-    <w:p>
-      <w:pPr/>
-      <w:r>
-        <w:rPr>
-          <w:rFonts w:ascii="Menlo" w:hAnsi="Menlo" w:cs="Menlo"/>
-          <w:sz w:val="24"/>
-          <w:sz-cs w:val="24"/>
-          <w:spacing w:val="0"/>
-          <w:color w:val="DFE8F2"/>
-        </w:rPr>
-        <w:t xml:space="preserve">};</w:t>
-      </w:r>
-    </w:p>
-    <w:p>
-      <w:pPr/>
-      <w:r>
-        <w:rPr>
-          <w:rFonts w:ascii="Menlo" w:hAnsi="Menlo" w:cs="Menlo"/>
-          <w:sz w:val="24"/>
-          <w:sz-cs w:val="24"/>
-          <w:spacing w:val="0"/>
-          <w:color w:val="DFE8F2"/>
-        </w:rPr>
-        <w:t xml:space="preserve"/>
-      </w:r>
-    </w:p>
-    <w:p>
-      <w:pPr/>
-      <w:r>
-        <w:rPr>
-          <w:rFonts w:ascii="Menlo" w:hAnsi="Menlo" w:cs="Menlo"/>
-          <w:sz w:val="24"/>
-          <w:sz-cs w:val="24"/>
-          <w:spacing w:val="0"/>
-          <w:color w:val="DFE8F2"/>
-        </w:rPr>
-        <w:t xml:space="preserve">export type AgentManifest = {</w:t>
-      </w:r>
-    </w:p>
-    <w:p>
-      <w:pPr/>
-      <w:r>
-        <w:rPr>
-          <w:rFonts w:ascii="Menlo" w:hAnsi="Menlo" w:cs="Menlo"/>
-          <w:sz w:val="24"/>
-          <w:sz-cs w:val="24"/>
-          <w:spacing w:val="0"/>
-          <w:color w:val="DFE8F2"/>
-        </w:rPr>
-        <w:t xml:space="preserve">  id: string;</w:t>
-      </w:r>
-    </w:p>
-    <w:p>
-      <w:pPr/>
-      <w:r>
-        <w:rPr>
-          <w:rFonts w:ascii="Menlo" w:hAnsi="Menlo" w:cs="Menlo"/>
-          <w:sz w:val="24"/>
-          <w:sz-cs w:val="24"/>
-          <w:spacing w:val="0"/>
-          <w:color w:val="DFE8F2"/>
-        </w:rPr>
-        <w:t xml:space="preserve">  owner: OwnerRef;</w:t>
-      </w:r>
-    </w:p>
-    <w:p>
-      <w:pPr/>
-      <w:r>
-        <w:rPr>
-          <w:rFonts w:ascii="Menlo" w:hAnsi="Menlo" w:cs="Menlo"/>
-          <w:sz w:val="24"/>
-          <w:sz-cs w:val="24"/>
-          <w:spacing w:val="0"/>
-          <w:color w:val="DFE8F2"/>
-        </w:rPr>
-        <w:t xml:space="preserve">  trust_domain: TrustDomain;</w:t>
-      </w:r>
-    </w:p>
-    <w:p>
-      <w:pPr/>
-      <w:r>
-        <w:rPr>
-          <w:rFonts w:ascii="Menlo" w:hAnsi="Menlo" w:cs="Menlo"/>
-          <w:sz w:val="24"/>
-          <w:sz-cs w:val="24"/>
-          <w:spacing w:val="0"/>
-          <w:color w:val="DFE8F2"/>
-        </w:rPr>
-        <w:t xml:space="preserve">  role: string;</w:t>
-      </w:r>
-    </w:p>
-    <w:p>
-      <w:pPr/>
-      <w:r>
-        <w:rPr>
-          <w:rFonts w:ascii="Menlo" w:hAnsi="Menlo" w:cs="Menlo"/>
-          <w:sz w:val="24"/>
-          <w:sz-cs w:val="24"/>
-          <w:spacing w:val="0"/>
-          <w:color w:val="DFE8F2"/>
-        </w:rPr>
-        <w:t xml:space="preserve">  capabilities: string[];</w:t>
-      </w:r>
-    </w:p>
-    <w:p>
-      <w:pPr/>
-      <w:r>
-        <w:rPr>
-          <w:rFonts w:ascii="Menlo" w:hAnsi="Menlo" w:cs="Menlo"/>
-          <w:sz w:val="24"/>
-          <w:sz-cs w:val="24"/>
-          <w:spacing w:val="0"/>
-          <w:color w:val="DFE8F2"/>
-        </w:rPr>
-        <w:t xml:space="preserve">  exposed_capabilities: string[];</w:t>
-      </w:r>
-    </w:p>
-    <w:p>
-      <w:pPr/>
-      <w:r>
-        <w:rPr>
-          <w:rFonts w:ascii="Menlo" w:hAnsi="Menlo" w:cs="Menlo"/>
-          <w:sz w:val="24"/>
-          <w:sz-cs w:val="24"/>
-          <w:spacing w:val="0"/>
-          <w:color w:val="DFE8F2"/>
-        </w:rPr>
-        <w:t xml:space="preserve">  dependencies: string[];</w:t>
-      </w:r>
-    </w:p>
-    <w:p>
-      <w:pPr/>
-      <w:r>
-        <w:rPr>
-          <w:rFonts w:ascii="Menlo" w:hAnsi="Menlo" w:cs="Menlo"/>
-          <w:sz w:val="24"/>
-          <w:sz-cs w:val="24"/>
-          <w:spacing w:val="0"/>
-          <w:color w:val="DFE8F2"/>
-        </w:rPr>
-        <w:t xml:space="preserve">  runtime: RuntimeProfile;</w:t>
-      </w:r>
-    </w:p>
-    <w:p>
-      <w:pPr/>
-      <w:r>
-        <w:rPr>
-          <w:rFonts w:ascii="Menlo" w:hAnsi="Menlo" w:cs="Menlo"/>
-          <w:sz w:val="24"/>
-          <w:sz-cs w:val="24"/>
-          <w:spacing w:val="0"/>
-          <w:color w:val="DFE8F2"/>
-        </w:rPr>
-        <w:t xml:space="preserve">  lifecycle: LifecyclePolicy;</w:t>
-      </w:r>
-    </w:p>
-    <w:p>
-      <w:pPr/>
-      <w:r>
-        <w:rPr>
-          <w:rFonts w:ascii="Menlo" w:hAnsi="Menlo" w:cs="Menlo"/>
-          <w:sz w:val="24"/>
-          <w:sz-cs w:val="24"/>
-          <w:spacing w:val="0"/>
-          <w:color w:val="DFE8F2"/>
-        </w:rPr>
-        <w:t xml:space="preserve">  encounter_policy: EncounterPolicy;</w:t>
-      </w:r>
-    </w:p>
-    <w:p>
-      <w:pPr/>
-      <w:r>
-        <w:rPr>
-          <w:rFonts w:ascii="Menlo" w:hAnsi="Menlo" w:cs="Menlo"/>
-          <w:sz w:val="24"/>
-          <w:sz-cs w:val="24"/>
-          <w:spacing w:val="0"/>
-          <w:color w:val="DFE8F2"/>
-        </w:rPr>
-        <w:t xml:space="preserve">  contract_defaults: ExecutionContract;</w:t>
-      </w:r>
-    </w:p>
-    <w:p>
-      <w:pPr/>
-      <w:r>
-        <w:rPr>
-          <w:rFonts w:ascii="Menlo" w:hAnsi="Menlo" w:cs="Menlo"/>
-          <w:sz w:val="24"/>
-          <w:sz-cs w:val="24"/>
-          <w:spacing w:val="0"/>
-          <w:color w:val="DFE8F2"/>
-        </w:rPr>
-        <w:t xml:space="preserve">  adapters: AdapterBinding[];</w:t>
-      </w:r>
-    </w:p>
-    <w:p>
-      <w:pPr/>
-      <w:r>
-        <w:rPr>
-          <w:rFonts w:ascii="Menlo" w:hAnsi="Menlo" w:cs="Menlo"/>
-          <w:sz w:val="24"/>
-          <w:sz-cs w:val="24"/>
-          <w:spacing w:val="0"/>
-          <w:color w:val="DFE8F2"/>
-        </w:rPr>
-        <w:t xml:space="preserve">  workspace_policy: WorkspacePolicy;</w:t>
-      </w:r>
-    </w:p>
-    <w:p>
-      <w:pPr/>
-      <w:r>
-        <w:rPr>
-          <w:rFonts w:ascii="Menlo" w:hAnsi="Menlo" w:cs="Menlo"/>
-          <w:sz w:val="24"/>
-          <w:sz-cs w:val="24"/>
-          <w:spacing w:val="0"/>
-          <w:color w:val="DFE8F2"/>
-        </w:rPr>
-        <w:t xml:space="preserve">  default_data_boundaries: string[];</w:t>
-      </w:r>
-    </w:p>
-    <w:p>
-      <w:pPr/>
-      <w:r>
-        <w:rPr>
-          <w:rFonts w:ascii="Menlo" w:hAnsi="Menlo" w:cs="Menlo"/>
-          <w:sz w:val="24"/>
-          <w:sz-cs w:val="24"/>
-          <w:spacing w:val="0"/>
-          <w:color w:val="DFE8F2"/>
-        </w:rPr>
-        <w:t xml:space="preserve">  strategy_defaults: Record&lt;string, ExecutionStrategy&gt;;</w:t>
-      </w:r>
-    </w:p>
-    <w:p>
-      <w:pPr/>
-      <w:r>
-        <w:rPr>
-          <w:rFonts w:ascii="Menlo" w:hAnsi="Menlo" w:cs="Menlo"/>
-          <w:sz w:val="24"/>
-          <w:sz-cs w:val="24"/>
-          <w:spacing w:val="0"/>
-          <w:color w:val="DFE8F2"/>
-        </w:rPr>
-        <w:t xml:space="preserve">};</w:t>
-      </w:r>
-    </w:p>
-    <w:p>
-      <w:pPr/>
-      <w:r>
-        <w:rPr>
-          <w:rFonts w:ascii="Menlo" w:hAnsi="Menlo" w:cs="Menlo"/>
-          <w:sz w:val="24"/>
-          <w:sz-cs w:val="24"/>
-          <w:spacing w:val="0"/>
-          <w:color w:val="DFE8F2"/>
-        </w:rPr>
-        <w:t xml:space="preserve"/>
-      </w:r>
-    </w:p>
-    <w:p>
-      <w:pPr/>
-      <w:r>
-        <w:rPr>
-          <w:rFonts w:ascii="Menlo" w:hAnsi="Menlo" w:cs="Menlo"/>
-          <w:sz w:val="24"/>
-          <w:sz-cs w:val="24"/>
-          <w:spacing w:val="0"/>
-          <w:color w:val="DFE8F2"/>
-        </w:rPr>
-        <w:t xml:space="preserve">export type Action = {</w:t>
-      </w:r>
-    </w:p>
-    <w:p>
-      <w:pPr/>
-      <w:r>
-        <w:rPr>
-          <w:rFonts w:ascii="Menlo" w:hAnsi="Menlo" w:cs="Menlo"/>
-          <w:sz w:val="24"/>
-          <w:sz-cs w:val="24"/>
-          <w:spacing w:val="0"/>
-          <w:color w:val="DFE8F2"/>
-        </w:rPr>
-        <w:t xml:space="preserve">  id: string;</w:t>
-      </w:r>
-    </w:p>
-    <w:p>
-      <w:pPr/>
-      <w:r>
-        <w:rPr>
-          <w:rFonts w:ascii="Menlo" w:hAnsi="Menlo" w:cs="Menlo"/>
-          <w:sz w:val="24"/>
-          <w:sz-cs w:val="24"/>
-          <w:spacing w:val="0"/>
-          <w:color w:val="DFE8F2"/>
-        </w:rPr>
-        <w:t xml:space="preserve">  requester: RequesterRef;</w:t>
-      </w:r>
-    </w:p>
-    <w:p>
-      <w:pPr/>
-      <w:r>
-        <w:rPr>
-          <w:rFonts w:ascii="Menlo" w:hAnsi="Menlo" w:cs="Menlo"/>
-          <w:sz w:val="24"/>
-          <w:sz-cs w:val="24"/>
-          <w:spacing w:val="0"/>
-          <w:color w:val="DFE8F2"/>
-        </w:rPr>
-        <w:t xml:space="preserve">  initiator_owner: OwnerRef;</w:t>
-      </w:r>
-    </w:p>
-    <w:p>
-      <w:pPr/>
-      <w:r>
-        <w:rPr>
-          <w:rFonts w:ascii="Menlo" w:hAnsi="Menlo" w:cs="Menlo"/>
-          <w:sz w:val="24"/>
-          <w:sz-cs w:val="24"/>
-          <w:spacing w:val="0"/>
-          <w:color w:val="DFE8F2"/>
-        </w:rPr>
-        <w:t xml:space="preserve">  counterparty_refs: CounterpartyRef[];</w:t>
-      </w:r>
-    </w:p>
-    <w:p>
-      <w:pPr/>
-      <w:r>
-        <w:rPr>
-          <w:rFonts w:ascii="Menlo" w:hAnsi="Menlo" w:cs="Menlo"/>
-          <w:sz w:val="24"/>
-          <w:sz-cs w:val="24"/>
-          <w:spacing w:val="0"/>
-          <w:color w:val="DFE8F2"/>
-        </w:rPr>
-        <w:t xml:space="preserve">  goal: GoalSpec;</w:t>
-      </w:r>
-    </w:p>
-    <w:p>
-      <w:pPr/>
-      <w:r>
-        <w:rPr>
-          <w:rFonts w:ascii="Menlo" w:hAnsi="Menlo" w:cs="Menlo"/>
-          <w:sz w:val="24"/>
-          <w:sz-cs w:val="24"/>
-          <w:spacing w:val="0"/>
-          <w:color w:val="DFE8F2"/>
-        </w:rPr>
-        <w:t xml:space="preserve">  capability: string;</w:t>
-      </w:r>
-    </w:p>
-    <w:p>
-      <w:pPr/>
-      <w:r>
-        <w:rPr>
-          <w:rFonts w:ascii="Menlo" w:hAnsi="Menlo" w:cs="Menlo"/>
-          <w:sz w:val="24"/>
-          <w:sz-cs w:val="24"/>
-          <w:spacing w:val="0"/>
-          <w:color w:val="DFE8F2"/>
-        </w:rPr>
-        <w:t xml:space="preserve">  inputs: Record&lt;string, unknown&gt;;</w:t>
-      </w:r>
-    </w:p>
-    <w:p>
-      <w:pPr/>
-      <w:r>
-        <w:rPr>
-          <w:rFonts w:ascii="Menlo" w:hAnsi="Menlo" w:cs="Menlo"/>
-          <w:sz w:val="24"/>
-          <w:sz-cs w:val="24"/>
-          <w:spacing w:val="0"/>
-          <w:color w:val="DFE8F2"/>
-        </w:rPr>
-        <w:t xml:space="preserve">  contract: ExecutionContract;</w:t>
-      </w:r>
-    </w:p>
-    <w:p>
-      <w:pPr/>
-      <w:r>
-        <w:rPr>
-          <w:rFonts w:ascii="Menlo" w:hAnsi="Menlo" w:cs="Menlo"/>
-          <w:sz w:val="24"/>
-          <w:sz-cs w:val="24"/>
-          <w:spacing w:val="0"/>
-          <w:color w:val="DFE8F2"/>
-        </w:rPr>
-        <w:t xml:space="preserve">  execution_strategy: ExecutionStrategy | null;</w:t>
-      </w:r>
-    </w:p>
-    <w:p>
-      <w:pPr/>
-      <w:r>
-        <w:rPr>
-          <w:rFonts w:ascii="Menlo" w:hAnsi="Menlo" w:cs="Menlo"/>
-          <w:sz w:val="24"/>
-          <w:sz-cs w:val="24"/>
-          <w:spacing w:val="0"/>
-          <w:color w:val="DFE8F2"/>
-        </w:rPr>
-        <w:t xml:space="preserve">  grant_refs: string[];</w:t>
-      </w:r>
-    </w:p>
-    <w:p>
-      <w:pPr/>
-      <w:r>
-        <w:rPr>
-          <w:rFonts w:ascii="Menlo" w:hAnsi="Menlo" w:cs="Menlo"/>
-          <w:sz w:val="24"/>
-          <w:sz-cs w:val="24"/>
-          <w:spacing w:val="0"/>
-          <w:color w:val="DFE8F2"/>
-        </w:rPr>
-        <w:t xml:space="preserve">  lease_ref: string | null;</w:t>
-      </w:r>
-    </w:p>
-    <w:p>
-      <w:pPr/>
-      <w:r>
-        <w:rPr>
-          <w:rFonts w:ascii="Menlo" w:hAnsi="Menlo" w:cs="Menlo"/>
-          <w:sz w:val="24"/>
-          <w:sz-cs w:val="24"/>
-          <w:spacing w:val="0"/>
-          <w:color w:val="DFE8F2"/>
-        </w:rPr>
-        <w:t xml:space="preserve">  data_boundary: string;</w:t>
-      </w:r>
-    </w:p>
-    <w:p>
-      <w:pPr/>
-      <w:r>
-        <w:rPr>
-          <w:rFonts w:ascii="Menlo" w:hAnsi="Menlo" w:cs="Menlo"/>
-          <w:sz w:val="24"/>
-          <w:sz-cs w:val="24"/>
-          <w:spacing w:val="0"/>
-          <w:color w:val="DFE8F2"/>
-        </w:rPr>
-        <w:t xml:space="preserve">  schedule: ScheduleSpec;</w:t>
-      </w:r>
-    </w:p>
-    <w:p>
-      <w:pPr/>
-      <w:r>
-        <w:rPr>
-          <w:rFonts w:ascii="Menlo" w:hAnsi="Menlo" w:cs="Menlo"/>
-          <w:sz w:val="24"/>
-          <w:sz-cs w:val="24"/>
-          <w:spacing w:val="0"/>
-          <w:color w:val="DFE8F2"/>
-        </w:rPr>
-        <w:t xml:space="preserve">  phase: ActionPhase;</w:t>
-      </w:r>
-    </w:p>
-    <w:p>
-      <w:pPr/>
-      <w:r>
-        <w:rPr>
-          <w:rFonts w:ascii="Menlo" w:hAnsi="Menlo" w:cs="Menlo"/>
-          <w:sz w:val="24"/>
-          <w:sz-cs w:val="24"/>
-          <w:spacing w:val="0"/>
-          <w:color w:val="DFE8F2"/>
-        </w:rPr>
-        <w:t xml:space="preserve">  checkpoint_ref: string | null;</w:t>
-      </w:r>
-    </w:p>
-    <w:p>
-      <w:pPr/>
-      <w:r>
-        <w:rPr>
-          <w:rFonts w:ascii="Menlo" w:hAnsi="Menlo" w:cs="Menlo"/>
-          <w:sz w:val="24"/>
-          <w:sz-cs w:val="24"/>
-          <w:spacing w:val="0"/>
-          <w:color w:val="DFE8F2"/>
-        </w:rPr>
-        <w:t xml:space="preserve">  outputs: ActionOutputs;</w:t>
-      </w:r>
-    </w:p>
-    <w:p>
-      <w:pPr/>
-      <w:r>
-        <w:rPr>
-          <w:rFonts w:ascii="Menlo" w:hAnsi="Menlo" w:cs="Menlo"/>
-          <w:sz w:val="24"/>
-          <w:sz-cs w:val="24"/>
-          <w:spacing w:val="0"/>
-          <w:color w:val="DFE8F2"/>
-        </w:rPr>
-        <w:t xml:space="preserve">};</w:t>
-      </w:r>
-    </w:p>
-    <w:p>
-      <w:pPr/>
-      <w:r>
-        <w:rPr>
-          <w:rFonts w:ascii="Menlo" w:hAnsi="Menlo" w:cs="Menlo"/>
-          <w:sz w:val="24"/>
-          <w:sz-cs w:val="24"/>
-          <w:spacing w:val="0"/>
-          <w:color w:val="DFE8F2"/>
-        </w:rPr>
-        <w:t xml:space="preserve"/>
-      </w:r>
-    </w:p>
-    <w:p>
-      <w:pPr/>
-      <w:r>
-        <w:rPr>
-          <w:rFonts w:ascii="Menlo" w:hAnsi="Menlo" w:cs="Menlo"/>
-          <w:sz w:val="24"/>
-          <w:sz-cs w:val="24"/>
-          <w:spacing w:val="0"/>
-          <w:color w:val="DFE8F2"/>
-        </w:rPr>
-        <w:t xml:space="preserve">export type ExecutionContract = {</w:t>
-      </w:r>
-    </w:p>
-    <w:p>
-      <w:pPr/>
-      <w:r>
-        <w:rPr>
-          <w:rFonts w:ascii="Menlo" w:hAnsi="Menlo" w:cs="Menlo"/>
-          <w:sz w:val="24"/>
-          <w:sz-cs w:val="24"/>
-          <w:spacing w:val="0"/>
-          <w:color w:val="DFE8F2"/>
-        </w:rPr>
-        <w:t xml:space="preserve">  delivery: DeliveryContract;</w:t>
-      </w:r>
-    </w:p>
-    <w:p>
-      <w:pPr/>
-      <w:r>
-        <w:rPr>
-          <w:rFonts w:ascii="Menlo" w:hAnsi="Menlo" w:cs="Menlo"/>
-          <w:sz w:val="24"/>
-          <w:sz-cs w:val="24"/>
-          <w:spacing w:val="0"/>
-          <w:color w:val="DFE8F2"/>
-        </w:rPr>
-        <w:t xml:space="preserve">  execution: ExecutionPolicy;</w:t>
-      </w:r>
-    </w:p>
-    <w:p>
-      <w:pPr/>
-      <w:r>
-        <w:rPr>
-          <w:rFonts w:ascii="Menlo" w:hAnsi="Menlo" w:cs="Menlo"/>
-          <w:sz w:val="24"/>
-          <w:sz-cs w:val="24"/>
-          <w:spacing w:val="0"/>
-          <w:color w:val="DFE8F2"/>
-        </w:rPr>
-        <w:t xml:space="preserve">  safety: SafetyPolicy;</w:t>
-      </w:r>
-    </w:p>
-    <w:p>
-      <w:pPr/>
-      <w:r>
-        <w:rPr>
-          <w:rFonts w:ascii="Menlo" w:hAnsi="Menlo" w:cs="Menlo"/>
-          <w:sz w:val="24"/>
-          <w:sz-cs w:val="24"/>
-          <w:spacing w:val="0"/>
-          <w:color w:val="DFE8F2"/>
-        </w:rPr>
-        <w:t xml:space="preserve">  quality: QualityPolicy;</w:t>
-      </w:r>
-    </w:p>
-    <w:p>
-      <w:pPr/>
-      <w:r>
-        <w:rPr>
-          <w:rFonts w:ascii="Menlo" w:hAnsi="Menlo" w:cs="Menlo"/>
-          <w:sz w:val="24"/>
-          <w:sz-cs w:val="24"/>
-          <w:spacing w:val="0"/>
-          <w:color w:val="DFE8F2"/>
-        </w:rPr>
-        <w:t xml:space="preserve">  recovery: RecoveryPolicy;</w:t>
-      </w:r>
-    </w:p>
-    <w:p>
-      <w:pPr/>
-      <w:r>
-        <w:rPr>
-          <w:rFonts w:ascii="Menlo" w:hAnsi="Menlo" w:cs="Menlo"/>
-          <w:sz w:val="24"/>
-          <w:sz-cs w:val="24"/>
-          <w:spacing w:val="0"/>
-          <w:color w:val="DFE8F2"/>
-        </w:rPr>
-        <w:t xml:space="preserve">};</w:t>
-      </w:r>
-    </w:p>
-    <w:p>
-      <w:pPr/>
-      <w:r>
-        <w:rPr>
-          <w:rFonts w:ascii="Menlo" w:hAnsi="Menlo" w:cs="Menlo"/>
-          <w:sz w:val="24"/>
-          <w:sz-cs w:val="24"/>
-          <w:spacing w:val="0"/>
-          <w:color w:val="DFE8F2"/>
-        </w:rPr>
-        <w:t xml:space="preserve"/>
-      </w:r>
-    </w:p>
-    <w:p>
-      <w:pPr/>
-      <w:r>
-        <w:rPr>
-          <w:rFonts w:ascii="Menlo" w:hAnsi="Menlo" w:cs="Menlo"/>
-          <w:sz w:val="24"/>
-          <w:sz-cs w:val="24"/>
-          <w:spacing w:val="0"/>
-          <w:color w:val="DFE8F2"/>
-        </w:rPr>
-        <w:t xml:space="preserve">export type CapabilityDescriptor = {</w:t>
-      </w:r>
-    </w:p>
-    <w:p>
-      <w:pPr/>
-      <w:r>
-        <w:rPr>
-          <w:rFonts w:ascii="Menlo" w:hAnsi="Menlo" w:cs="Menlo"/>
-          <w:sz w:val="24"/>
-          <w:sz-cs w:val="24"/>
-          <w:spacing w:val="0"/>
-          <w:color w:val="DFE8F2"/>
-        </w:rPr>
-        <w:t xml:space="preserve">  namespace: string;</w:t>
-      </w:r>
-    </w:p>
-    <w:p>
-      <w:pPr/>
-      <w:r>
-        <w:rPr>
-          <w:rFonts w:ascii="Menlo" w:hAnsi="Menlo" w:cs="Menlo"/>
-          <w:sz w:val="24"/>
-          <w:sz-cs w:val="24"/>
-          <w:spacing w:val="0"/>
-          <w:color w:val="DFE8F2"/>
-        </w:rPr>
-        <w:t xml:space="preserve">  verbs: string[];</w:t>
-      </w:r>
-    </w:p>
-    <w:p>
-      <w:pPr/>
-      <w:r>
-        <w:rPr>
-          <w:rFonts w:ascii="Menlo" w:hAnsi="Menlo" w:cs="Menlo"/>
-          <w:sz w:val="24"/>
-          <w:sz-cs w:val="24"/>
-          <w:spacing w:val="0"/>
-          <w:color w:val="DFE8F2"/>
-        </w:rPr>
-        <w:t xml:space="preserve">  executor_class: "deterministic" | "agentic" | "hybrid";</w:t>
-      </w:r>
-    </w:p>
-    <w:p>
-      <w:pPr/>
-      <w:r>
-        <w:rPr>
-          <w:rFonts w:ascii="Menlo" w:hAnsi="Menlo" w:cs="Menlo"/>
-          <w:sz w:val="24"/>
-          <w:sz-cs w:val="24"/>
-          <w:spacing w:val="0"/>
-          <w:color w:val="DFE8F2"/>
-        </w:rPr>
-        <w:t xml:space="preserve">  mutability: "read_only" | "proposal_only" | "mutating";</w:t>
-      </w:r>
-    </w:p>
-    <w:p>
-      <w:pPr/>
-      <w:r>
-        <w:rPr>
-          <w:rFonts w:ascii="Menlo" w:hAnsi="Menlo" w:cs="Menlo"/>
-          <w:sz w:val="24"/>
-          <w:sz-cs w:val="24"/>
-          <w:spacing w:val="0"/>
-          <w:color w:val="DFE8F2"/>
-        </w:rPr>
-        <w:t xml:space="preserve">  risk_class: "low" | "medium" | "high";</w:t>
-      </w:r>
-    </w:p>
-    <w:p>
-      <w:pPr/>
-      <w:r>
-        <w:rPr>
-          <w:rFonts w:ascii="Menlo" w:hAnsi="Menlo" w:cs="Menlo"/>
-          <w:sz w:val="24"/>
-          <w:sz-cs w:val="24"/>
-          <w:spacing w:val="0"/>
-          <w:color w:val="DFE8F2"/>
-        </w:rPr>
-        <w:t xml:space="preserve">  cost_class: "cheap" | "standard" | "expensive";</w:t>
-      </w:r>
-    </w:p>
-    <w:p>
-      <w:pPr/>
-      <w:r>
-        <w:rPr>
-          <w:rFonts w:ascii="Menlo" w:hAnsi="Menlo" w:cs="Menlo"/>
-          <w:sz w:val="24"/>
-          <w:sz-cs w:val="24"/>
-          <w:spacing w:val="0"/>
-          <w:color w:val="DFE8F2"/>
-        </w:rPr>
-        <w:t xml:space="preserve">  latency_class: "interactive" | "background" | "long_running";</w:t>
-      </w:r>
-    </w:p>
-    <w:p>
-      <w:pPr/>
-      <w:r>
-        <w:rPr>
-          <w:rFonts w:ascii="Menlo" w:hAnsi="Menlo" w:cs="Menlo"/>
-          <w:sz w:val="24"/>
-          <w:sz-cs w:val="24"/>
-          <w:spacing w:val="0"/>
-          <w:color w:val="DFE8F2"/>
-        </w:rPr>
-        <w:t xml:space="preserve">  approval_requirements: ApprovalRequirement[];</w:t>
-      </w:r>
-    </w:p>
-    <w:p>
-      <w:pPr/>
-      <w:r>
-        <w:rPr>
-          <w:rFonts w:ascii="Menlo" w:hAnsi="Menlo" w:cs="Menlo"/>
-          <w:sz w:val="24"/>
-          <w:sz-cs w:val="24"/>
-          <w:spacing w:val="0"/>
-          <w:color w:val="DFE8F2"/>
-        </w:rPr>
-        <w:t xml:space="preserve">};</w:t>
-      </w:r>
-    </w:p>
-    <w:p>
-      <w:pPr/>
-      <w:r>
-        <w:rPr>
-          <w:rFonts w:ascii="Menlo" w:hAnsi="Menlo" w:cs="Menlo"/>
-          <w:sz w:val="24"/>
-          <w:sz-cs w:val="24"/>
-          <w:spacing w:val="0"/>
-          <w:color w:val="DFE8F2"/>
-        </w:rPr>
-        <w:t xml:space="preserve"/>
-      </w:r>
-    </w:p>
-    <w:p>
-      <w:pPr/>
-      <w:r>
-        <w:rPr>
-          <w:rFonts w:ascii="Menlo" w:hAnsi="Menlo" w:cs="Menlo"/>
-          <w:sz w:val="24"/>
-          <w:sz-cs w:val="24"/>
-          <w:spacing w:val="0"/>
-          <w:color w:val="DFE8F2"/>
-        </w:rPr>
-        <w:t xml:space="preserve">export type LifecycleRecord = {</w:t>
-      </w:r>
-    </w:p>
-    <w:p>
-      <w:pPr/>
-      <w:r>
-        <w:rPr>
-          <w:rFonts w:ascii="Menlo" w:hAnsi="Menlo" w:cs="Menlo"/>
-          <w:sz w:val="24"/>
-          <w:sz-cs w:val="24"/>
-          <w:spacing w:val="0"/>
-          <w:color w:val="DFE8F2"/>
-        </w:rPr>
-        <w:t xml:space="preserve">  agent_id: string;</w:t>
-      </w:r>
-    </w:p>
-    <w:p>
-      <w:pPr/>
-      <w:r>
-        <w:rPr>
-          <w:rFonts w:ascii="Menlo" w:hAnsi="Menlo" w:cs="Menlo"/>
-          <w:sz w:val="24"/>
-          <w:sz-cs w:val="24"/>
-          <w:spacing w:val="0"/>
-          <w:color w:val="DFE8F2"/>
-        </w:rPr>
-        <w:t xml:space="preserve">  desired_state: AgentState;</w:t>
-      </w:r>
-    </w:p>
-    <w:p>
-      <w:pPr/>
-      <w:r>
-        <w:rPr>
-          <w:rFonts w:ascii="Menlo" w:hAnsi="Menlo" w:cs="Menlo"/>
-          <w:sz w:val="24"/>
-          <w:sz-cs w:val="24"/>
-          <w:spacing w:val="0"/>
-          <w:color w:val="DFE8F2"/>
-        </w:rPr>
-        <w:t xml:space="preserve">  observed_state: AgentState;</w:t>
-      </w:r>
-    </w:p>
-    <w:p>
-      <w:pPr/>
-      <w:r>
-        <w:rPr>
-          <w:rFonts w:ascii="Menlo" w:hAnsi="Menlo" w:cs="Menlo"/>
-          <w:sz w:val="24"/>
-          <w:sz-cs w:val="24"/>
-          <w:spacing w:val="0"/>
-          <w:color w:val="DFE8F2"/>
-        </w:rPr>
-        <w:t xml:space="preserve">  health: HealthStatus;</w:t>
-      </w:r>
-    </w:p>
-    <w:p>
-      <w:pPr/>
-      <w:r>
-        <w:rPr>
-          <w:rFonts w:ascii="Menlo" w:hAnsi="Menlo" w:cs="Menlo"/>
-          <w:sz w:val="24"/>
-          <w:sz-cs w:val="24"/>
-          <w:spacing w:val="0"/>
-          <w:color w:val="DFE8F2"/>
-        </w:rPr>
-        <w:t xml:space="preserve">  transition_reason: string | null;</w:t>
-      </w:r>
-    </w:p>
-    <w:p>
-      <w:pPr/>
-      <w:r>
-        <w:rPr>
-          <w:rFonts w:ascii="Menlo" w:hAnsi="Menlo" w:cs="Menlo"/>
-          <w:sz w:val="24"/>
-          <w:sz-cs w:val="24"/>
-          <w:spacing w:val="0"/>
-          <w:color w:val="DFE8F2"/>
-        </w:rPr>
-        <w:t xml:space="preserve">  last_transition_at: string;</w:t>
-      </w:r>
-    </w:p>
-    <w:p>
-      <w:pPr/>
-      <w:r>
-        <w:rPr>
-          <w:rFonts w:ascii="Menlo" w:hAnsi="Menlo" w:cs="Menlo"/>
-          <w:sz w:val="24"/>
-          <w:sz-cs w:val="24"/>
-          <w:spacing w:val="0"/>
-          <w:color w:val="DFE8F2"/>
-        </w:rPr>
-        <w:t xml:space="preserve">  degradation_profile: string | null;</w:t>
-      </w:r>
-    </w:p>
-    <w:p>
-      <w:pPr/>
-      <w:r>
-        <w:rPr>
-          <w:rFonts w:ascii="Menlo" w:hAnsi="Menlo" w:cs="Menlo"/>
-          <w:sz w:val="24"/>
-          <w:sz-cs w:val="24"/>
-          <w:spacing w:val="0"/>
-          <w:color w:val="DFE8F2"/>
-        </w:rPr>
-        <w:t xml:space="preserve">  continuity_mode: ContinuityModeName | null;</w:t>
-      </w:r>
-    </w:p>
-    <w:p>
-      <w:pPr/>
-      <w:r>
-        <w:rPr>
-          <w:rFonts w:ascii="Menlo" w:hAnsi="Menlo" w:cs="Menlo"/>
-          <w:sz w:val="24"/>
-          <w:sz-cs w:val="24"/>
-          <w:spacing w:val="0"/>
-          <w:color w:val="DFE8F2"/>
-        </w:rPr>
-        <w:t xml:space="preserve">  failure_count: number;</w:t>
-      </w:r>
-    </w:p>
-    <w:p>
-      <w:pPr/>
-      <w:r>
-        <w:rPr>
-          <w:rFonts w:ascii="Menlo" w:hAnsi="Menlo" w:cs="Menlo"/>
-          <w:sz w:val="24"/>
-          <w:sz-cs w:val="24"/>
-          <w:spacing w:val="0"/>
-          <w:color w:val="DFE8F2"/>
-        </w:rPr>
-        <w:t xml:space="preserve">};</w:t>
-      </w:r>
-    </w:p>
-    <w:p>
-      <w:pPr/>
-      <w:r>
-        <w:rPr>
-          <w:rFonts w:ascii="Menlo" w:hAnsi="Menlo" w:cs="Menlo"/>
-          <w:sz w:val="24"/>
-          <w:sz-cs w:val="24"/>
-          <w:spacing w:val="0"/>
-          <w:color w:val="DFE8F2"/>
-        </w:rPr>
-        <w:t xml:space="preserve"/>
-      </w:r>
-    </w:p>
-    <w:p>
-      <w:pPr/>
-      <w:r>
-        <w:rPr>
-          <w:rFonts w:ascii="Menlo" w:hAnsi="Menlo" w:cs="Menlo"/>
-          <w:sz w:val="24"/>
-          <w:sz-cs w:val="24"/>
-          <w:spacing w:val="0"/>
-          <w:color w:val="DFE8F2"/>
-        </w:rPr>
-        <w:t xml:space="preserve">export type EncounterRecord = {</w:t>
-      </w:r>
-    </w:p>
-    <w:p>
-      <w:pPr/>
-      <w:r>
-        <w:rPr>
-          <w:rFonts w:ascii="Menlo" w:hAnsi="Menlo" w:cs="Menlo"/>
-          <w:sz w:val="24"/>
-          <w:sz-cs w:val="24"/>
-          <w:spacing w:val="0"/>
-          <w:color w:val="DFE8F2"/>
-        </w:rPr>
-        <w:t xml:space="preserve">  id: string;</w:t>
-      </w:r>
-    </w:p>
-    <w:p>
-      <w:pPr/>
-      <w:r>
-        <w:rPr>
-          <w:rFonts w:ascii="Menlo" w:hAnsi="Menlo" w:cs="Menlo"/>
-          <w:sz w:val="24"/>
-          <w:sz-cs w:val="24"/>
-          <w:spacing w:val="0"/>
-          <w:color w:val="DFE8F2"/>
-        </w:rPr>
-        <w:t xml:space="preserve">  initiator_ref: CounterpartyRef;</w:t>
-      </w:r>
-    </w:p>
-    <w:p>
-      <w:pPr/>
-      <w:r>
-        <w:rPr>
-          <w:rFonts w:ascii="Menlo" w:hAnsi="Menlo" w:cs="Menlo"/>
-          <w:sz w:val="24"/>
-          <w:sz-cs w:val="24"/>
-          <w:spacing w:val="0"/>
-          <w:color w:val="DFE8F2"/>
-        </w:rPr>
-        <w:t xml:space="preserve">  target_agent_id: string;</w:t>
-      </w:r>
-    </w:p>
-    <w:p>
-      <w:pPr/>
-      <w:r>
-        <w:rPr>
-          <w:rFonts w:ascii="Menlo" w:hAnsi="Menlo" w:cs="Menlo"/>
-          <w:sz w:val="24"/>
-          <w:sz-cs w:val="24"/>
-          <w:spacing w:val="0"/>
-          <w:color w:val="DFE8F2"/>
-        </w:rPr>
-        <w:t xml:space="preserve">  target_owner: OwnerRef;</w:t>
-      </w:r>
-    </w:p>
-    <w:p>
-      <w:pPr/>
-      <w:r>
-        <w:rPr>
-          <w:rFonts w:ascii="Menlo" w:hAnsi="Menlo" w:cs="Menlo"/>
-          <w:sz w:val="24"/>
-          <w:sz-cs w:val="24"/>
-          <w:spacing w:val="0"/>
-          <w:color w:val="DFE8F2"/>
-        </w:rPr>
-        <w:t xml:space="preserve">  trust_domain: TrustDomain;</w:t>
-      </w:r>
-    </w:p>
-    <w:p>
-      <w:pPr/>
-      <w:r>
-        <w:rPr>
-          <w:rFonts w:ascii="Menlo" w:hAnsi="Menlo" w:cs="Menlo"/>
-          <w:sz w:val="24"/>
-          <w:sz-cs w:val="24"/>
-          <w:spacing w:val="0"/>
-          <w:color w:val="DFE8F2"/>
-        </w:rPr>
-        <w:t xml:space="preserve">  requested_capabilities: string[];</w:t>
-      </w:r>
-    </w:p>
-    <w:p>
-      <w:pPr/>
-      <w:r>
-        <w:rPr>
-          <w:rFonts w:ascii="Menlo" w:hAnsi="Menlo" w:cs="Menlo"/>
-          <w:sz w:val="24"/>
-          <w:sz-cs w:val="24"/>
-          <w:spacing w:val="0"/>
-          <w:color w:val="DFE8F2"/>
-        </w:rPr>
-        <w:t xml:space="preserve">  applied_policy_source: string;</w:t>
-      </w:r>
-    </w:p>
-    <w:p>
-      <w:pPr/>
-      <w:r>
-        <w:rPr>
-          <w:rFonts w:ascii="Menlo" w:hAnsi="Menlo" w:cs="Menlo"/>
-          <w:sz w:val="24"/>
-          <w:sz-cs w:val="24"/>
-          <w:spacing w:val="0"/>
-          <w:color w:val="DFE8F2"/>
-        </w:rPr>
-        <w:t xml:space="preserve">  state: EncounterState;</w:t>
-      </w:r>
-    </w:p>
-    <w:p>
-      <w:pPr/>
-      <w:r>
-        <w:rPr>
-          <w:rFonts w:ascii="Menlo" w:hAnsi="Menlo" w:cs="Menlo"/>
-          <w:sz w:val="24"/>
-          <w:sz-cs w:val="24"/>
-          <w:spacing w:val="0"/>
-          <w:color w:val="DFE8F2"/>
-        </w:rPr>
-        <w:t xml:space="preserve">  grant_refs: string[];</w:t>
-      </w:r>
-    </w:p>
-    <w:p>
-      <w:pPr/>
-      <w:r>
-        <w:rPr>
-          <w:rFonts w:ascii="Menlo" w:hAnsi="Menlo" w:cs="Menlo"/>
-          <w:sz w:val="24"/>
-          <w:sz-cs w:val="24"/>
-          <w:spacing w:val="0"/>
-          <w:color w:val="DFE8F2"/>
-        </w:rPr>
-        <w:t xml:space="preserve">  lease_ref: string | null;</w:t>
-      </w:r>
-    </w:p>
-    <w:p>
-      <w:pPr/>
-      <w:r>
-        <w:rPr>
-          <w:rFonts w:ascii="Menlo" w:hAnsi="Menlo" w:cs="Menlo"/>
-          <w:sz w:val="24"/>
-          <w:sz-cs w:val="24"/>
-          <w:spacing w:val="0"/>
-          <w:color w:val="DFE8F2"/>
-        </w:rPr>
-        <w:t xml:space="preserve">  created_at: string;</w:t>
-      </w:r>
-    </w:p>
-    <w:p>
-      <w:pPr/>
-      <w:r>
-        <w:rPr>
-          <w:rFonts w:ascii="Menlo" w:hAnsi="Menlo" w:cs="Menlo"/>
-          <w:sz w:val="24"/>
-          <w:sz-cs w:val="24"/>
-          <w:spacing w:val="0"/>
-          <w:color w:val="DFE8F2"/>
-        </w:rPr>
-        <w:t xml:space="preserve">};</w:t>
-      </w:r>
-    </w:p>
-    <w:p>
-      <w:pPr/>
-      <w:r>
-        <w:rPr>
-          <w:rFonts w:ascii="Menlo" w:hAnsi="Menlo" w:cs="Menlo"/>
-          <w:sz w:val="24"/>
-          <w:sz-cs w:val="24"/>
-          <w:spacing w:val="0"/>
-          <w:color w:val="DFE8F2"/>
-        </w:rPr>
-        <w:t xml:space="preserve"/>
-      </w:r>
-    </w:p>
-    <w:p>
-      <w:pPr/>
-      <w:r>
-        <w:rPr>
-          <w:rFonts w:ascii="Menlo" w:hAnsi="Menlo" w:cs="Menlo"/>
-          <w:sz w:val="24"/>
-          <w:sz-cs w:val="24"/>
-          <w:spacing w:val="0"/>
-          <w:color w:val="DFE8F2"/>
-        </w:rPr>
-        <w:t xml:space="preserve">export type ConsentGrant = {</w:t>
-      </w:r>
-    </w:p>
-    <w:p>
-      <w:pPr/>
-      <w:r>
-        <w:rPr>
-          <w:rFonts w:ascii="Menlo" w:hAnsi="Menlo" w:cs="Menlo"/>
-          <w:sz w:val="24"/>
-          <w:sz-cs w:val="24"/>
-          <w:spacing w:val="0"/>
-          <w:color w:val="DFE8F2"/>
-        </w:rPr>
-        <w:t xml:space="preserve">  id: string;</w:t>
-      </w:r>
-    </w:p>
-    <w:p>
-      <w:pPr/>
-      <w:r>
-        <w:rPr>
-          <w:rFonts w:ascii="Menlo" w:hAnsi="Menlo" w:cs="Menlo"/>
-          <w:sz w:val="24"/>
-          <w:sz-cs w:val="24"/>
-          <w:spacing w:val="0"/>
-          <w:color w:val="DFE8F2"/>
-        </w:rPr>
-        <w:t xml:space="preserve">  grantor: OwnerRef;</w:t>
-      </w:r>
-    </w:p>
-    <w:p>
-      <w:pPr/>
-      <w:r>
-        <w:rPr>
-          <w:rFonts w:ascii="Menlo" w:hAnsi="Menlo" w:cs="Menlo"/>
-          <w:sz w:val="24"/>
-          <w:sz-cs w:val="24"/>
-          <w:spacing w:val="0"/>
-          <w:color w:val="DFE8F2"/>
-        </w:rPr>
-        <w:t xml:space="preserve">  grantee: OwnerRef;</w:t>
-      </w:r>
-    </w:p>
-    <w:p>
-      <w:pPr/>
-      <w:r>
-        <w:rPr>
-          <w:rFonts w:ascii="Menlo" w:hAnsi="Menlo" w:cs="Menlo"/>
-          <w:sz w:val="24"/>
-          <w:sz-cs w:val="24"/>
-          <w:spacing w:val="0"/>
-          <w:color w:val="DFE8F2"/>
-        </w:rPr>
-        <w:t xml:space="preserve">  purpose: string;</w:t>
-      </w:r>
-    </w:p>
-    <w:p>
-      <w:pPr/>
-      <w:r>
-        <w:rPr>
-          <w:rFonts w:ascii="Menlo" w:hAnsi="Menlo" w:cs="Menlo"/>
-          <w:sz w:val="24"/>
-          <w:sz-cs w:val="24"/>
-          <w:spacing w:val="0"/>
-          <w:color w:val="DFE8F2"/>
-        </w:rPr>
-        <w:t xml:space="preserve">  scope: string[];</w:t>
-      </w:r>
-    </w:p>
-    <w:p>
-      <w:pPr/>
-      <w:r>
-        <w:rPr>
-          <w:rFonts w:ascii="Menlo" w:hAnsi="Menlo" w:cs="Menlo"/>
-          <w:sz w:val="24"/>
-          <w:sz-cs w:val="24"/>
-          <w:spacing w:val="0"/>
-          <w:color w:val="DFE8F2"/>
-        </w:rPr>
-        <w:t xml:space="preserve">  issued_at: string;</w:t>
-      </w:r>
-    </w:p>
-    <w:p>
-      <w:pPr/>
-      <w:r>
-        <w:rPr>
-          <w:rFonts w:ascii="Menlo" w:hAnsi="Menlo" w:cs="Menlo"/>
-          <w:sz w:val="24"/>
-          <w:sz-cs w:val="24"/>
-          <w:spacing w:val="0"/>
-          <w:color w:val="DFE8F2"/>
-        </w:rPr>
-        <w:t xml:space="preserve">  expires_at: string;</w:t>
-      </w:r>
-    </w:p>
-    <w:p>
-      <w:pPr/>
-      <w:r>
-        <w:rPr>
-          <w:rFonts w:ascii="Menlo" w:hAnsi="Menlo" w:cs="Menlo"/>
-          <w:sz w:val="24"/>
-          <w:sz-cs w:val="24"/>
-          <w:spacing w:val="0"/>
-          <w:color w:val="DFE8F2"/>
-        </w:rPr>
-        <w:t xml:space="preserve">  revocable: true;</w:t>
-      </w:r>
-    </w:p>
-    <w:p>
-      <w:pPr/>
-      <w:r>
-        <w:rPr>
-          <w:rFonts w:ascii="Menlo" w:hAnsi="Menlo" w:cs="Menlo"/>
-          <w:sz w:val="24"/>
-          <w:sz-cs w:val="24"/>
-          <w:spacing w:val="0"/>
-          <w:color w:val="DFE8F2"/>
-        </w:rPr>
-        <w:t xml:space="preserve">  approver_ref: string | null;</w:t>
-      </w:r>
-    </w:p>
-    <w:p>
-      <w:pPr/>
-      <w:r>
-        <w:rPr>
-          <w:rFonts w:ascii="Menlo" w:hAnsi="Menlo" w:cs="Menlo"/>
-          <w:sz w:val="24"/>
-          <w:sz-cs w:val="24"/>
-          <w:spacing w:val="0"/>
-          <w:color w:val="DFE8F2"/>
-        </w:rPr>
-        <w:t xml:space="preserve">};</w:t>
-      </w:r>
-    </w:p>
-    <w:p>
-      <w:pPr/>
-      <w:r>
-        <w:rPr>
-          <w:rFonts w:ascii="Menlo" w:hAnsi="Menlo" w:cs="Menlo"/>
-          <w:sz w:val="24"/>
-          <w:sz-cs w:val="24"/>
-          <w:spacing w:val="0"/>
-          <w:color w:val="DFE8F2"/>
-        </w:rPr>
-        <w:t xml:space="preserve"/>
-      </w:r>
-    </w:p>
-    <w:p>
-      <w:pPr/>
-      <w:r>
-        <w:rPr>
-          <w:rFonts w:ascii="Menlo" w:hAnsi="Menlo" w:cs="Menlo"/>
-          <w:sz w:val="24"/>
-          <w:sz-cs w:val="24"/>
-          <w:spacing w:val="0"/>
-          <w:color w:val="DFE8F2"/>
-        </w:rPr>
-        <w:t xml:space="preserve">export type CapabilityLease = {</w:t>
-      </w:r>
-    </w:p>
-    <w:p>
-      <w:pPr/>
-      <w:r>
-        <w:rPr>
-          <w:rFonts w:ascii="Menlo" w:hAnsi="Menlo" w:cs="Menlo"/>
-          <w:sz w:val="24"/>
-          <w:sz-cs w:val="24"/>
-          <w:spacing w:val="0"/>
-          <w:color w:val="DFE8F2"/>
-        </w:rPr>
-        <w:t xml:space="preserve">  id: string;</w:t>
-      </w:r>
-    </w:p>
-    <w:p>
-      <w:pPr/>
-      <w:r>
-        <w:rPr>
-          <w:rFonts w:ascii="Menlo" w:hAnsi="Menlo" w:cs="Menlo"/>
-          <w:sz w:val="24"/>
-          <w:sz-cs w:val="24"/>
-          <w:spacing w:val="0"/>
-          <w:color w:val="DFE8F2"/>
-        </w:rPr>
-        <w:t xml:space="preserve">  grant_ref: string;</w:t>
-      </w:r>
-    </w:p>
-    <w:p>
-      <w:pPr/>
-      <w:r>
-        <w:rPr>
-          <w:rFonts w:ascii="Menlo" w:hAnsi="Menlo" w:cs="Menlo"/>
-          <w:sz w:val="24"/>
-          <w:sz-cs w:val="24"/>
-          <w:spacing w:val="0"/>
-          <w:color w:val="DFE8F2"/>
-        </w:rPr>
-        <w:t xml:space="preserve">  lessor: OwnerRef;</w:t>
-      </w:r>
-    </w:p>
-    <w:p>
-      <w:pPr/>
-      <w:r>
-        <w:rPr>
-          <w:rFonts w:ascii="Menlo" w:hAnsi="Menlo" w:cs="Menlo"/>
-          <w:sz w:val="24"/>
-          <w:sz-cs w:val="24"/>
-          <w:spacing w:val="0"/>
-          <w:color w:val="DFE8F2"/>
-        </w:rPr>
-        <w:t xml:space="preserve">  lessee: OwnerRef;</w:t>
-      </w:r>
-    </w:p>
-    <w:p>
-      <w:pPr/>
-      <w:r>
-        <w:rPr>
-          <w:rFonts w:ascii="Menlo" w:hAnsi="Menlo" w:cs="Menlo"/>
-          <w:sz w:val="24"/>
-          <w:sz-cs w:val="24"/>
-          <w:spacing w:val="0"/>
-          <w:color w:val="DFE8F2"/>
-        </w:rPr>
-        <w:t xml:space="preserve">  capability_refs: string[];</w:t>
-      </w:r>
-    </w:p>
-    <w:p>
-      <w:pPr/>
-      <w:r>
-        <w:rPr>
-          <w:rFonts w:ascii="Menlo" w:hAnsi="Menlo" w:cs="Menlo"/>
-          <w:sz w:val="24"/>
-          <w:sz-cs w:val="24"/>
-          <w:spacing w:val="0"/>
-          <w:color w:val="DFE8F2"/>
-        </w:rPr>
-        <w:t xml:space="preserve">  scope: string[];</w:t>
-      </w:r>
-    </w:p>
-    <w:p>
-      <w:pPr/>
-      <w:r>
-        <w:rPr>
-          <w:rFonts w:ascii="Menlo" w:hAnsi="Menlo" w:cs="Menlo"/>
-          <w:sz w:val="24"/>
-          <w:sz-cs w:val="24"/>
-          <w:spacing w:val="0"/>
-          <w:color w:val="DFE8F2"/>
-        </w:rPr>
-        <w:t xml:space="preserve">  issued_at: string;</w:t>
-      </w:r>
-    </w:p>
-    <w:p>
-      <w:pPr/>
-      <w:r>
-        <w:rPr>
-          <w:rFonts w:ascii="Menlo" w:hAnsi="Menlo" w:cs="Menlo"/>
-          <w:sz w:val="24"/>
-          <w:sz-cs w:val="24"/>
-          <w:spacing w:val="0"/>
-          <w:color w:val="DFE8F2"/>
-        </w:rPr>
-        <w:t xml:space="preserve">  expires_at: string;</w:t>
-      </w:r>
-    </w:p>
-    <w:p>
-      <w:pPr/>
-      <w:r>
-        <w:rPr>
-          <w:rFonts w:ascii="Menlo" w:hAnsi="Menlo" w:cs="Menlo"/>
-          <w:sz w:val="24"/>
-          <w:sz-cs w:val="24"/>
-          <w:spacing w:val="0"/>
-          <w:color w:val="DFE8F2"/>
-        </w:rPr>
-        <w:t xml:space="preserve">  revocation_reason: string | null;</w:t>
-      </w:r>
-    </w:p>
-    <w:p>
-      <w:pPr/>
-      <w:r>
-        <w:rPr>
-          <w:rFonts w:ascii="Menlo" w:hAnsi="Menlo" w:cs="Menlo"/>
-          <w:sz w:val="24"/>
-          <w:sz-cs w:val="24"/>
-          <w:spacing w:val="0"/>
-          <w:color w:val="DFE8F2"/>
-        </w:rPr>
-        <w:t xml:space="preserve">  audit_receipt_ref: string;</w:t>
-      </w:r>
-    </w:p>
-    <w:p>
-      <w:pPr/>
-      <w:r>
-        <w:rPr>
-          <w:rFonts w:ascii="Menlo" w:hAnsi="Menlo" w:cs="Menlo"/>
-          <w:sz w:val="24"/>
-          <w:sz-cs w:val="24"/>
-          <w:spacing w:val="0"/>
-          <w:color w:val="DFE8F2"/>
-        </w:rPr>
-        <w:t xml:space="preserve">};</w:t>
-      </w:r>
-    </w:p>
-    <w:p>
-      <w:pPr/>
-      <w:r>
-        <w:rPr>
-          <w:rFonts w:ascii="Menlo" w:hAnsi="Menlo" w:cs="Menlo"/>
-          <w:sz w:val="24"/>
-          <w:sz-cs w:val="24"/>
-          <w:spacing w:val="0"/>
-          <w:color w:val="DFE8F2"/>
-        </w:rPr>
-        <w:t xml:space="preserve"/>
-      </w:r>
-    </w:p>
-    <w:p>
-      <w:pPr/>
-      <w:r>
-        <w:rPr>
-          <w:rFonts w:ascii="Menlo" w:hAnsi="Menlo" w:cs="Menlo"/>
-          <w:sz w:val="24"/>
-          <w:sz-cs w:val="24"/>
-          <w:spacing w:val="0"/>
-          <w:color w:val="DFE8F2"/>
-        </w:rPr>
-        <w:t xml:space="preserve">export type AuditReceipt = {</w:t>
-      </w:r>
-    </w:p>
-    <w:p>
-      <w:pPr/>
-      <w:r>
-        <w:rPr>
-          <w:rFonts w:ascii="Menlo" w:hAnsi="Menlo" w:cs="Menlo"/>
-          <w:sz w:val="24"/>
-          <w:sz-cs w:val="24"/>
-          <w:spacing w:val="0"/>
-          <w:color w:val="DFE8F2"/>
-        </w:rPr>
-        <w:t xml:space="preserve">  id: string;</w:t>
-      </w:r>
-    </w:p>
-    <w:p>
-      <w:pPr/>
-      <w:r>
-        <w:rPr>
-          <w:rFonts w:ascii="Menlo" w:hAnsi="Menlo" w:cs="Menlo"/>
-          <w:sz w:val="24"/>
-          <w:sz-cs w:val="24"/>
-          <w:spacing w:val="0"/>
-          <w:color w:val="DFE8F2"/>
-        </w:rPr>
-        <w:t xml:space="preserve">  encounter_ref: string;</w:t>
-      </w:r>
-    </w:p>
-    <w:p>
-      <w:pPr/>
-      <w:r>
-        <w:rPr>
-          <w:rFonts w:ascii="Menlo" w:hAnsi="Menlo" w:cs="Menlo"/>
-          <w:sz w:val="24"/>
-          <w:sz-cs w:val="24"/>
-          <w:spacing w:val="0"/>
-          <w:color w:val="DFE8F2"/>
-        </w:rPr>
-        <w:t xml:space="preserve">  grant_refs: string[];</w:t>
-      </w:r>
-    </w:p>
-    <w:p>
-      <w:pPr/>
-      <w:r>
-        <w:rPr>
-          <w:rFonts w:ascii="Menlo" w:hAnsi="Menlo" w:cs="Menlo"/>
-          <w:sz w:val="24"/>
-          <w:sz-cs w:val="24"/>
-          <w:spacing w:val="0"/>
-          <w:color w:val="DFE8F2"/>
-        </w:rPr>
-        <w:t xml:space="preserve">  lease_ref: string | null;</w:t>
-      </w:r>
-    </w:p>
-    <w:p>
-      <w:pPr/>
-      <w:r>
-        <w:rPr>
-          <w:rFonts w:ascii="Menlo" w:hAnsi="Menlo" w:cs="Menlo"/>
-          <w:sz w:val="24"/>
-          <w:sz-cs w:val="24"/>
-          <w:spacing w:val="0"/>
-          <w:color w:val="DFE8F2"/>
-        </w:rPr>
-        <w:t xml:space="preserve">  outcome: "allowed" | "denied" | "revoked" | "expired";</w:t>
-      </w:r>
-    </w:p>
-    <w:p>
-      <w:pPr/>
-      <w:r>
-        <w:rPr>
-          <w:rFonts w:ascii="Menlo" w:hAnsi="Menlo" w:cs="Menlo"/>
-          <w:sz w:val="24"/>
-          <w:sz-cs w:val="24"/>
-          <w:spacing w:val="0"/>
-          <w:color w:val="DFE8F2"/>
-        </w:rPr>
-        <w:t xml:space="preserve">  reason: string;</w:t>
-      </w:r>
-    </w:p>
-    <w:p>
-      <w:pPr/>
-      <w:r>
-        <w:rPr>
-          <w:rFonts w:ascii="Menlo" w:hAnsi="Menlo" w:cs="Menlo"/>
-          <w:sz w:val="24"/>
-          <w:sz-cs w:val="24"/>
-          <w:spacing w:val="0"/>
-          <w:color w:val="DFE8F2"/>
-        </w:rPr>
-        <w:t xml:space="preserve">  approver_ref: string | null;</w:t>
-      </w:r>
-    </w:p>
-    <w:p>
-      <w:pPr/>
-      <w:r>
-        <w:rPr>
-          <w:rFonts w:ascii="Menlo" w:hAnsi="Menlo" w:cs="Menlo"/>
-          <w:sz w:val="24"/>
-          <w:sz-cs w:val="24"/>
-          <w:spacing w:val="0"/>
-          <w:color w:val="DFE8F2"/>
-        </w:rPr>
-        <w:t xml:space="preserve">  emitted_at: string;</w:t>
-      </w:r>
-    </w:p>
-    <w:p>
-      <w:pPr/>
-      <w:r>
-        <w:rPr>
-          <w:rFonts w:ascii="Menlo" w:hAnsi="Menlo" w:cs="Menlo"/>
-          <w:sz w:val="24"/>
-          <w:sz-cs w:val="24"/>
-          <w:spacing w:val="0"/>
-          <w:color w:val="DFE8F2"/>
-        </w:rPr>
-        <w:t xml:space="preserve">};</w:t>
+        <w:t xml:space="preserve">pub struct OwnerRef {</w:t>
+      </w:r>
+    </w:p>
+    <w:p>
+      <w:pPr/>
+      <w:r>
+        <w:rPr>
+          <w:rFonts w:ascii="Menlo" w:hAnsi="Menlo" w:cs="Menlo"/>
+          <w:sz w:val="24"/>
+          <w:sz-cs w:val="24"/>
+          <w:spacing w:val="0"/>
+          <w:color w:val="DFE8F2"/>
+        </w:rPr>
+        <w:t xml:space="preserve">  pub kind: OwnerKind,</w:t>
+      </w:r>
+    </w:p>
+    <w:p>
+      <w:pPr/>
+      <w:r>
+        <w:rPr>
+          <w:rFonts w:ascii="Menlo" w:hAnsi="Menlo" w:cs="Menlo"/>
+          <w:sz w:val="24"/>
+          <w:sz-cs w:val="24"/>
+          <w:spacing w:val="0"/>
+          <w:color w:val="DFE8F2"/>
+        </w:rPr>
+        <w:t xml:space="preserve">  pub id: String,</w:t>
+      </w:r>
+    </w:p>
+    <w:p>
+      <w:pPr/>
+      <w:r>
+        <w:rPr>
+          <w:rFonts w:ascii="Menlo" w:hAnsi="Menlo" w:cs="Menlo"/>
+          <w:sz w:val="24"/>
+          <w:sz-cs w:val="24"/>
+          <w:spacing w:val="0"/>
+          <w:color w:val="DFE8F2"/>
+        </w:rPr>
+        <w:t xml:space="preserve">  pub display_name: Option&lt;String&gt;,</w:t>
+      </w:r>
+    </w:p>
+    <w:p>
+      <w:pPr/>
+      <w:r>
+        <w:rPr>
+          <w:rFonts w:ascii="Menlo" w:hAnsi="Menlo" w:cs="Menlo"/>
+          <w:sz w:val="24"/>
+          <w:sz-cs w:val="24"/>
+          <w:spacing w:val="0"/>
+          <w:color w:val="DFE8F2"/>
+        </w:rPr>
+        <w:t xml:space="preserve">}</w:t>
+      </w:r>
+    </w:p>
+    <w:p>
+      <w:pPr/>
+      <w:r>
+        <w:rPr>
+          <w:rFonts w:ascii="Menlo" w:hAnsi="Menlo" w:cs="Menlo"/>
+          <w:sz w:val="24"/>
+          <w:sz-cs w:val="24"/>
+          <w:spacing w:val="0"/>
+          <w:color w:val="DFE8F2"/>
+        </w:rPr>
+        <w:t xml:space="preserve"/>
+      </w:r>
+    </w:p>
+    <w:p>
+      <w:pPr/>
+      <w:r>
+        <w:rPr>
+          <w:rFonts w:ascii="Menlo" w:hAnsi="Menlo" w:cs="Menlo"/>
+          <w:sz w:val="24"/>
+          <w:sz-cs w:val="24"/>
+          <w:spacing w:val="0"/>
+          <w:color w:val="DFE8F2"/>
+        </w:rPr>
+        <w:t xml:space="preserve">pub struct AgentManifest {</w:t>
+      </w:r>
+    </w:p>
+    <w:p>
+      <w:pPr/>
+      <w:r>
+        <w:rPr>
+          <w:rFonts w:ascii="Menlo" w:hAnsi="Menlo" w:cs="Menlo"/>
+          <w:sz w:val="24"/>
+          <w:sz-cs w:val="24"/>
+          <w:spacing w:val="0"/>
+          <w:color w:val="DFE8F2"/>
+        </w:rPr>
+        <w:t xml:space="preserve">  pub id: String,</w:t>
+      </w:r>
+    </w:p>
+    <w:p>
+      <w:pPr/>
+      <w:r>
+        <w:rPr>
+          <w:rFonts w:ascii="Menlo" w:hAnsi="Menlo" w:cs="Menlo"/>
+          <w:sz w:val="24"/>
+          <w:sz-cs w:val="24"/>
+          <w:spacing w:val="0"/>
+          <w:color w:val="DFE8F2"/>
+        </w:rPr>
+        <w:t xml:space="preserve">  pub owner: OwnerRef,</w:t>
+      </w:r>
+    </w:p>
+    <w:p>
+      <w:pPr/>
+      <w:r>
+        <w:rPr>
+          <w:rFonts w:ascii="Menlo" w:hAnsi="Menlo" w:cs="Menlo"/>
+          <w:sz w:val="24"/>
+          <w:sz-cs w:val="24"/>
+          <w:spacing w:val="0"/>
+          <w:color w:val="DFE8F2"/>
+        </w:rPr>
+        <w:t xml:space="preserve">  pub trust_domain: TrustDomain,</w:t>
+      </w:r>
+    </w:p>
+    <w:p>
+      <w:pPr/>
+      <w:r>
+        <w:rPr>
+          <w:rFonts w:ascii="Menlo" w:hAnsi="Menlo" w:cs="Menlo"/>
+          <w:sz w:val="24"/>
+          <w:sz-cs w:val="24"/>
+          <w:spacing w:val="0"/>
+          <w:color w:val="DFE8F2"/>
+        </w:rPr>
+        <w:t xml:space="preserve">  pub role: String,</w:t>
+      </w:r>
+    </w:p>
+    <w:p>
+      <w:pPr/>
+      <w:r>
+        <w:rPr>
+          <w:rFonts w:ascii="Menlo" w:hAnsi="Menlo" w:cs="Menlo"/>
+          <w:sz w:val="24"/>
+          <w:sz-cs w:val="24"/>
+          <w:spacing w:val="0"/>
+          <w:color w:val="DFE8F2"/>
+        </w:rPr>
+        <w:t xml:space="preserve">  pub capabilities: Vec&lt;String&gt;,</w:t>
+      </w:r>
+    </w:p>
+    <w:p>
+      <w:pPr/>
+      <w:r>
+        <w:rPr>
+          <w:rFonts w:ascii="Menlo" w:hAnsi="Menlo" w:cs="Menlo"/>
+          <w:sz w:val="24"/>
+          <w:sz-cs w:val="24"/>
+          <w:spacing w:val="0"/>
+          <w:color w:val="DFE8F2"/>
+        </w:rPr>
+        <w:t xml:space="preserve">  pub exposed_capabilities: Vec&lt;String&gt;,</w:t>
+      </w:r>
+    </w:p>
+    <w:p>
+      <w:pPr/>
+      <w:r>
+        <w:rPr>
+          <w:rFonts w:ascii="Menlo" w:hAnsi="Menlo" w:cs="Menlo"/>
+          <w:sz w:val="24"/>
+          <w:sz-cs w:val="24"/>
+          <w:spacing w:val="0"/>
+          <w:color w:val="DFE8F2"/>
+        </w:rPr>
+        <w:t xml:space="preserve">  pub dependencies: Vec&lt;String&gt;,</w:t>
+      </w:r>
+    </w:p>
+    <w:p>
+      <w:pPr/>
+      <w:r>
+        <w:rPr>
+          <w:rFonts w:ascii="Menlo" w:hAnsi="Menlo" w:cs="Menlo"/>
+          <w:sz w:val="24"/>
+          <w:sz-cs w:val="24"/>
+          <w:spacing w:val="0"/>
+          <w:color w:val="DFE8F2"/>
+        </w:rPr>
+        <w:t xml:space="preserve">  pub runtime: RuntimeProfile,</w:t>
+      </w:r>
+    </w:p>
+    <w:p>
+      <w:pPr/>
+      <w:r>
+        <w:rPr>
+          <w:rFonts w:ascii="Menlo" w:hAnsi="Menlo" w:cs="Menlo"/>
+          <w:sz w:val="24"/>
+          <w:sz-cs w:val="24"/>
+          <w:spacing w:val="0"/>
+          <w:color w:val="DFE8F2"/>
+        </w:rPr>
+        <w:t xml:space="preserve">  pub lifecycle: LifecyclePolicy,</w:t>
+      </w:r>
+    </w:p>
+    <w:p>
+      <w:pPr/>
+      <w:r>
+        <w:rPr>
+          <w:rFonts w:ascii="Menlo" w:hAnsi="Menlo" w:cs="Menlo"/>
+          <w:sz w:val="24"/>
+          <w:sz-cs w:val="24"/>
+          <w:spacing w:val="0"/>
+          <w:color w:val="DFE8F2"/>
+        </w:rPr>
+        <w:t xml:space="preserve">  pub encounter_policy: EncounterPolicy,</w:t>
+      </w:r>
+    </w:p>
+    <w:p>
+      <w:pPr/>
+      <w:r>
+        <w:rPr>
+          <w:rFonts w:ascii="Menlo" w:hAnsi="Menlo" w:cs="Menlo"/>
+          <w:sz w:val="24"/>
+          <w:sz-cs w:val="24"/>
+          <w:spacing w:val="0"/>
+          <w:color w:val="DFE8F2"/>
+        </w:rPr>
+        <w:t xml:space="preserve">  pub contract_defaults: ExecutionContract,</w:t>
+      </w:r>
+    </w:p>
+    <w:p>
+      <w:pPr/>
+      <w:r>
+        <w:rPr>
+          <w:rFonts w:ascii="Menlo" w:hAnsi="Menlo" w:cs="Menlo"/>
+          <w:sz w:val="24"/>
+          <w:sz-cs w:val="24"/>
+          <w:spacing w:val="0"/>
+          <w:color w:val="DFE8F2"/>
+        </w:rPr>
+        <w:t xml:space="preserve">  pub adapters: Vec&lt;AdapterBinding&gt;,</w:t>
+      </w:r>
+    </w:p>
+    <w:p>
+      <w:pPr/>
+      <w:r>
+        <w:rPr>
+          <w:rFonts w:ascii="Menlo" w:hAnsi="Menlo" w:cs="Menlo"/>
+          <w:sz w:val="24"/>
+          <w:sz-cs w:val="24"/>
+          <w:spacing w:val="0"/>
+          <w:color w:val="DFE8F2"/>
+        </w:rPr>
+        <w:t xml:space="preserve">  pub workspace_policy: WorkspacePolicy,</w:t>
+      </w:r>
+    </w:p>
+    <w:p>
+      <w:pPr/>
+      <w:r>
+        <w:rPr>
+          <w:rFonts w:ascii="Menlo" w:hAnsi="Menlo" w:cs="Menlo"/>
+          <w:sz w:val="24"/>
+          <w:sz-cs w:val="24"/>
+          <w:spacing w:val="0"/>
+          <w:color w:val="DFE8F2"/>
+        </w:rPr>
+        <w:t xml:space="preserve">  pub default_data_boundaries: Vec&lt;String&gt;,</w:t>
+      </w:r>
+    </w:p>
+    <w:p>
+      <w:pPr/>
+      <w:r>
+        <w:rPr>
+          <w:rFonts w:ascii="Menlo" w:hAnsi="Menlo" w:cs="Menlo"/>
+          <w:sz w:val="24"/>
+          <w:sz-cs w:val="24"/>
+          <w:spacing w:val="0"/>
+          <w:color w:val="DFE8F2"/>
+        </w:rPr>
+        <w:t xml:space="preserve">  pub strategy_defaults: BTreeMap&lt;String, ExecutionStrategy&gt;,</w:t>
+      </w:r>
+    </w:p>
+    <w:p>
+      <w:pPr/>
+      <w:r>
+        <w:rPr>
+          <w:rFonts w:ascii="Menlo" w:hAnsi="Menlo" w:cs="Menlo"/>
+          <w:sz w:val="24"/>
+          <w:sz-cs w:val="24"/>
+          <w:spacing w:val="0"/>
+          <w:color w:val="DFE8F2"/>
+        </w:rPr>
+        <w:t xml:space="preserve">}</w:t>
+      </w:r>
+    </w:p>
+    <w:p>
+      <w:pPr/>
+      <w:r>
+        <w:rPr>
+          <w:rFonts w:ascii="Menlo" w:hAnsi="Menlo" w:cs="Menlo"/>
+          <w:sz w:val="24"/>
+          <w:sz-cs w:val="24"/>
+          <w:spacing w:val="0"/>
+          <w:color w:val="DFE8F2"/>
+        </w:rPr>
+        <w:t xml:space="preserve"/>
+      </w:r>
+    </w:p>
+    <w:p>
+      <w:pPr/>
+      <w:r>
+        <w:rPr>
+          <w:rFonts w:ascii="Menlo" w:hAnsi="Menlo" w:cs="Menlo"/>
+          <w:sz w:val="24"/>
+          <w:sz-cs w:val="24"/>
+          <w:spacing w:val="0"/>
+          <w:color w:val="DFE8F2"/>
+        </w:rPr>
+        <w:t xml:space="preserve">pub struct Action {</w:t>
+      </w:r>
+    </w:p>
+    <w:p>
+      <w:pPr/>
+      <w:r>
+        <w:rPr>
+          <w:rFonts w:ascii="Menlo" w:hAnsi="Menlo" w:cs="Menlo"/>
+          <w:sz w:val="24"/>
+          <w:sz-cs w:val="24"/>
+          <w:spacing w:val="0"/>
+          <w:color w:val="DFE8F2"/>
+        </w:rPr>
+        <w:t xml:space="preserve">  pub id: String,</w:t>
+      </w:r>
+    </w:p>
+    <w:p>
+      <w:pPr/>
+      <w:r>
+        <w:rPr>
+          <w:rFonts w:ascii="Menlo" w:hAnsi="Menlo" w:cs="Menlo"/>
+          <w:sz w:val="24"/>
+          <w:sz-cs w:val="24"/>
+          <w:spacing w:val="0"/>
+          <w:color w:val="DFE8F2"/>
+        </w:rPr>
+        <w:t xml:space="preserve">  pub requester: RequesterRef,</w:t>
+      </w:r>
+    </w:p>
+    <w:p>
+      <w:pPr/>
+      <w:r>
+        <w:rPr>
+          <w:rFonts w:ascii="Menlo" w:hAnsi="Menlo" w:cs="Menlo"/>
+          <w:sz w:val="24"/>
+          <w:sz-cs w:val="24"/>
+          <w:spacing w:val="0"/>
+          <w:color w:val="DFE8F2"/>
+        </w:rPr>
+        <w:t xml:space="preserve">  pub initiator_owner: OwnerRef,</w:t>
+      </w:r>
+    </w:p>
+    <w:p>
+      <w:pPr/>
+      <w:r>
+        <w:rPr>
+          <w:rFonts w:ascii="Menlo" w:hAnsi="Menlo" w:cs="Menlo"/>
+          <w:sz w:val="24"/>
+          <w:sz-cs w:val="24"/>
+          <w:spacing w:val="0"/>
+          <w:color w:val="DFE8F2"/>
+        </w:rPr>
+        <w:t xml:space="preserve">  pub counterparty_refs: Vec&lt;CounterpartyRef&gt;,</w:t>
+      </w:r>
+    </w:p>
+    <w:p>
+      <w:pPr/>
+      <w:r>
+        <w:rPr>
+          <w:rFonts w:ascii="Menlo" w:hAnsi="Menlo" w:cs="Menlo"/>
+          <w:sz w:val="24"/>
+          <w:sz-cs w:val="24"/>
+          <w:spacing w:val="0"/>
+          <w:color w:val="DFE8F2"/>
+        </w:rPr>
+        <w:t xml:space="preserve">  pub goal: GoalSpec,</w:t>
+      </w:r>
+    </w:p>
+    <w:p>
+      <w:pPr/>
+      <w:r>
+        <w:rPr>
+          <w:rFonts w:ascii="Menlo" w:hAnsi="Menlo" w:cs="Menlo"/>
+          <w:sz w:val="24"/>
+          <w:sz-cs w:val="24"/>
+          <w:spacing w:val="0"/>
+          <w:color w:val="DFE8F2"/>
+        </w:rPr>
+        <w:t xml:space="preserve">  pub capability: String,</w:t>
+      </w:r>
+    </w:p>
+    <w:p>
+      <w:pPr/>
+      <w:r>
+        <w:rPr>
+          <w:rFonts w:ascii="Menlo" w:hAnsi="Menlo" w:cs="Menlo"/>
+          <w:sz w:val="24"/>
+          <w:sz-cs w:val="24"/>
+          <w:spacing w:val="0"/>
+          <w:color w:val="DFE8F2"/>
+        </w:rPr>
+        <w:t xml:space="preserve">  pub inputs: Metadata,</w:t>
+      </w:r>
+    </w:p>
+    <w:p>
+      <w:pPr/>
+      <w:r>
+        <w:rPr>
+          <w:rFonts w:ascii="Menlo" w:hAnsi="Menlo" w:cs="Menlo"/>
+          <w:sz w:val="24"/>
+          <w:sz-cs w:val="24"/>
+          <w:spacing w:val="0"/>
+          <w:color w:val="DFE8F2"/>
+        </w:rPr>
+        <w:t xml:space="preserve">  pub contract: ExecutionContract,</w:t>
+      </w:r>
+    </w:p>
+    <w:p>
+      <w:pPr/>
+      <w:r>
+        <w:rPr>
+          <w:rFonts w:ascii="Menlo" w:hAnsi="Menlo" w:cs="Menlo"/>
+          <w:sz w:val="24"/>
+          <w:sz-cs w:val="24"/>
+          <w:spacing w:val="0"/>
+          <w:color w:val="DFE8F2"/>
+        </w:rPr>
+        <w:t xml:space="preserve">  pub execution_strategy: Option&lt;ExecutionStrategy&gt;,</w:t>
+      </w:r>
+    </w:p>
+    <w:p>
+      <w:pPr/>
+      <w:r>
+        <w:rPr>
+          <w:rFonts w:ascii="Menlo" w:hAnsi="Menlo" w:cs="Menlo"/>
+          <w:sz w:val="24"/>
+          <w:sz-cs w:val="24"/>
+          <w:spacing w:val="0"/>
+          <w:color w:val="DFE8F2"/>
+        </w:rPr>
+        <w:t xml:space="preserve">  pub grant_refs: Vec&lt;String&gt;,</w:t>
+      </w:r>
+    </w:p>
+    <w:p>
+      <w:pPr/>
+      <w:r>
+        <w:rPr>
+          <w:rFonts w:ascii="Menlo" w:hAnsi="Menlo" w:cs="Menlo"/>
+          <w:sz w:val="24"/>
+          <w:sz-cs w:val="24"/>
+          <w:spacing w:val="0"/>
+          <w:color w:val="DFE8F2"/>
+        </w:rPr>
+        <w:t xml:space="preserve">  pub lease_ref: Option&lt;String&gt;,</w:t>
+      </w:r>
+    </w:p>
+    <w:p>
+      <w:pPr/>
+      <w:r>
+        <w:rPr>
+          <w:rFonts w:ascii="Menlo" w:hAnsi="Menlo" w:cs="Menlo"/>
+          <w:sz w:val="24"/>
+          <w:sz-cs w:val="24"/>
+          <w:spacing w:val="0"/>
+          <w:color w:val="DFE8F2"/>
+        </w:rPr>
+        <w:t xml:space="preserve">  pub data_boundary: String,</w:t>
+      </w:r>
+    </w:p>
+    <w:p>
+      <w:pPr/>
+      <w:r>
+        <w:rPr>
+          <w:rFonts w:ascii="Menlo" w:hAnsi="Menlo" w:cs="Menlo"/>
+          <w:sz w:val="24"/>
+          <w:sz-cs w:val="24"/>
+          <w:spacing w:val="0"/>
+          <w:color w:val="DFE8F2"/>
+        </w:rPr>
+        <w:t xml:space="preserve">  pub schedule: ScheduleSpec,</w:t>
+      </w:r>
+    </w:p>
+    <w:p>
+      <w:pPr/>
+      <w:r>
+        <w:rPr>
+          <w:rFonts w:ascii="Menlo" w:hAnsi="Menlo" w:cs="Menlo"/>
+          <w:sz w:val="24"/>
+          <w:sz-cs w:val="24"/>
+          <w:spacing w:val="0"/>
+          <w:color w:val="DFE8F2"/>
+        </w:rPr>
+        <w:t xml:space="preserve">  pub phase: ActionPhase,</w:t>
+      </w:r>
+    </w:p>
+    <w:p>
+      <w:pPr/>
+      <w:r>
+        <w:rPr>
+          <w:rFonts w:ascii="Menlo" w:hAnsi="Menlo" w:cs="Menlo"/>
+          <w:sz w:val="24"/>
+          <w:sz-cs w:val="24"/>
+          <w:spacing w:val="0"/>
+          <w:color w:val="DFE8F2"/>
+        </w:rPr>
+        <w:t xml:space="preserve">  pub checkpoint_ref: Option&lt;String&gt;,</w:t>
+      </w:r>
+    </w:p>
+    <w:p>
+      <w:pPr/>
+      <w:r>
+        <w:rPr>
+          <w:rFonts w:ascii="Menlo" w:hAnsi="Menlo" w:cs="Menlo"/>
+          <w:sz w:val="24"/>
+          <w:sz-cs w:val="24"/>
+          <w:spacing w:val="0"/>
+          <w:color w:val="DFE8F2"/>
+        </w:rPr>
+        <w:t xml:space="preserve">  pub outputs: ActionOutputs,</w:t>
+      </w:r>
+    </w:p>
+    <w:p>
+      <w:pPr/>
+      <w:r>
+        <w:rPr>
+          <w:rFonts w:ascii="Menlo" w:hAnsi="Menlo" w:cs="Menlo"/>
+          <w:sz w:val="24"/>
+          <w:sz-cs w:val="24"/>
+          <w:spacing w:val="0"/>
+          <w:color w:val="DFE8F2"/>
+        </w:rPr>
+        <w:t xml:space="preserve">}</w:t>
+      </w:r>
+    </w:p>
+    <w:p>
+      <w:pPr/>
+      <w:r>
+        <w:rPr>
+          <w:rFonts w:ascii="Menlo" w:hAnsi="Menlo" w:cs="Menlo"/>
+          <w:sz w:val="24"/>
+          <w:sz-cs w:val="24"/>
+          <w:spacing w:val="0"/>
+          <w:color w:val="DFE8F2"/>
+        </w:rPr>
+        <w:t xml:space="preserve"/>
+      </w:r>
+    </w:p>
+    <w:p>
+      <w:pPr/>
+      <w:r>
+        <w:rPr>
+          <w:rFonts w:ascii="Menlo" w:hAnsi="Menlo" w:cs="Menlo"/>
+          <w:sz w:val="24"/>
+          <w:sz-cs w:val="24"/>
+          <w:spacing w:val="0"/>
+          <w:color w:val="DFE8F2"/>
+        </w:rPr>
+        <w:t xml:space="preserve">pub struct ExecutionContract {</w:t>
+      </w:r>
+    </w:p>
+    <w:p>
+      <w:pPr/>
+      <w:r>
+        <w:rPr>
+          <w:rFonts w:ascii="Menlo" w:hAnsi="Menlo" w:cs="Menlo"/>
+          <w:sz w:val="24"/>
+          <w:sz-cs w:val="24"/>
+          <w:spacing w:val="0"/>
+          <w:color w:val="DFE8F2"/>
+        </w:rPr>
+        <w:t xml:space="preserve">  pub delivery: DeliveryContract,</w:t>
+      </w:r>
+    </w:p>
+    <w:p>
+      <w:pPr/>
+      <w:r>
+        <w:rPr>
+          <w:rFonts w:ascii="Menlo" w:hAnsi="Menlo" w:cs="Menlo"/>
+          <w:sz w:val="24"/>
+          <w:sz-cs w:val="24"/>
+          <w:spacing w:val="0"/>
+          <w:color w:val="DFE8F2"/>
+        </w:rPr>
+        <w:t xml:space="preserve">  pub execution: ExecutionPolicy,</w:t>
+      </w:r>
+    </w:p>
+    <w:p>
+      <w:pPr/>
+      <w:r>
+        <w:rPr>
+          <w:rFonts w:ascii="Menlo" w:hAnsi="Menlo" w:cs="Menlo"/>
+          <w:sz w:val="24"/>
+          <w:sz-cs w:val="24"/>
+          <w:spacing w:val="0"/>
+          <w:color w:val="DFE8F2"/>
+        </w:rPr>
+        <w:t xml:space="preserve">  pub safety: SafetyPolicy,</w:t>
+      </w:r>
+    </w:p>
+    <w:p>
+      <w:pPr/>
+      <w:r>
+        <w:rPr>
+          <w:rFonts w:ascii="Menlo" w:hAnsi="Menlo" w:cs="Menlo"/>
+          <w:sz w:val="24"/>
+          <w:sz-cs w:val="24"/>
+          <w:spacing w:val="0"/>
+          <w:color w:val="DFE8F2"/>
+        </w:rPr>
+        <w:t xml:space="preserve">  pub quality: QualityPolicy,</w:t>
+      </w:r>
+    </w:p>
+    <w:p>
+      <w:pPr/>
+      <w:r>
+        <w:rPr>
+          <w:rFonts w:ascii="Menlo" w:hAnsi="Menlo" w:cs="Menlo"/>
+          <w:sz w:val="24"/>
+          <w:sz-cs w:val="24"/>
+          <w:spacing w:val="0"/>
+          <w:color w:val="DFE8F2"/>
+        </w:rPr>
+        <w:t xml:space="preserve">  pub recovery: RecoveryPolicy,</w:t>
+      </w:r>
+    </w:p>
+    <w:p>
+      <w:pPr/>
+      <w:r>
+        <w:rPr>
+          <w:rFonts w:ascii="Menlo" w:hAnsi="Menlo" w:cs="Menlo"/>
+          <w:sz w:val="24"/>
+          <w:sz-cs w:val="24"/>
+          <w:spacing w:val="0"/>
+          <w:color w:val="DFE8F2"/>
+        </w:rPr>
+        <w:t xml:space="preserve">}</w:t>
+      </w:r>
+    </w:p>
+    <w:p>
+      <w:pPr/>
+      <w:r>
+        <w:rPr>
+          <w:rFonts w:ascii="Menlo" w:hAnsi="Menlo" w:cs="Menlo"/>
+          <w:sz w:val="24"/>
+          <w:sz-cs w:val="24"/>
+          <w:spacing w:val="0"/>
+          <w:color w:val="DFE8F2"/>
+        </w:rPr>
+        <w:t xml:space="preserve"/>
+      </w:r>
+    </w:p>
+    <w:p>
+      <w:pPr/>
+      <w:r>
+        <w:rPr>
+          <w:rFonts w:ascii="Menlo" w:hAnsi="Menlo" w:cs="Menlo"/>
+          <w:sz w:val="24"/>
+          <w:sz-cs w:val="24"/>
+          <w:spacing w:val="0"/>
+          <w:color w:val="DFE8F2"/>
+        </w:rPr>
+        <w:t xml:space="preserve">pub struct CapabilityDescriptor {</w:t>
+      </w:r>
+    </w:p>
+    <w:p>
+      <w:pPr/>
+      <w:r>
+        <w:rPr>
+          <w:rFonts w:ascii="Menlo" w:hAnsi="Menlo" w:cs="Menlo"/>
+          <w:sz w:val="24"/>
+          <w:sz-cs w:val="24"/>
+          <w:spacing w:val="0"/>
+          <w:color w:val="DFE8F2"/>
+        </w:rPr>
+        <w:t xml:space="preserve">  pub namespace: String,</w:t>
+      </w:r>
+    </w:p>
+    <w:p>
+      <w:pPr/>
+      <w:r>
+        <w:rPr>
+          <w:rFonts w:ascii="Menlo" w:hAnsi="Menlo" w:cs="Menlo"/>
+          <w:sz w:val="24"/>
+          <w:sz-cs w:val="24"/>
+          <w:spacing w:val="0"/>
+          <w:color w:val="DFE8F2"/>
+        </w:rPr>
+        <w:t xml:space="preserve">  pub verbs: Vec&lt;String&gt;,</w:t>
+      </w:r>
+    </w:p>
+    <w:p>
+      <w:pPr/>
+      <w:r>
+        <w:rPr>
+          <w:rFonts w:ascii="Menlo" w:hAnsi="Menlo" w:cs="Menlo"/>
+          <w:sz w:val="24"/>
+          <w:sz-cs w:val="24"/>
+          <w:spacing w:val="0"/>
+          <w:color w:val="DFE8F2"/>
+        </w:rPr>
+        <w:t xml:space="preserve">  pub executor_class: ExecutorClass,</w:t>
+      </w:r>
+    </w:p>
+    <w:p>
+      <w:pPr/>
+      <w:r>
+        <w:rPr>
+          <w:rFonts w:ascii="Menlo" w:hAnsi="Menlo" w:cs="Menlo"/>
+          <w:sz w:val="24"/>
+          <w:sz-cs w:val="24"/>
+          <w:spacing w:val="0"/>
+          <w:color w:val="DFE8F2"/>
+        </w:rPr>
+        <w:t xml:space="preserve">  pub mutability: Mutability,</w:t>
+      </w:r>
+    </w:p>
+    <w:p>
+      <w:pPr/>
+      <w:r>
+        <w:rPr>
+          <w:rFonts w:ascii="Menlo" w:hAnsi="Menlo" w:cs="Menlo"/>
+          <w:sz w:val="24"/>
+          <w:sz-cs w:val="24"/>
+          <w:spacing w:val="0"/>
+          <w:color w:val="DFE8F2"/>
+        </w:rPr>
+        <w:t xml:space="preserve">  pub risk_class: RiskClass,</w:t>
+      </w:r>
+    </w:p>
+    <w:p>
+      <w:pPr/>
+      <w:r>
+        <w:rPr>
+          <w:rFonts w:ascii="Menlo" w:hAnsi="Menlo" w:cs="Menlo"/>
+          <w:sz w:val="24"/>
+          <w:sz-cs w:val="24"/>
+          <w:spacing w:val="0"/>
+          <w:color w:val="DFE8F2"/>
+        </w:rPr>
+        <w:t xml:space="preserve">  pub cost_class: CostClass,</w:t>
+      </w:r>
+    </w:p>
+    <w:p>
+      <w:pPr/>
+      <w:r>
+        <w:rPr>
+          <w:rFonts w:ascii="Menlo" w:hAnsi="Menlo" w:cs="Menlo"/>
+          <w:sz w:val="24"/>
+          <w:sz-cs w:val="24"/>
+          <w:spacing w:val="0"/>
+          <w:color w:val="DFE8F2"/>
+        </w:rPr>
+        <w:t xml:space="preserve">  pub latency_class: LatencyClass,</w:t>
+      </w:r>
+    </w:p>
+    <w:p>
+      <w:pPr/>
+      <w:r>
+        <w:rPr>
+          <w:rFonts w:ascii="Menlo" w:hAnsi="Menlo" w:cs="Menlo"/>
+          <w:sz w:val="24"/>
+          <w:sz-cs w:val="24"/>
+          <w:spacing w:val="0"/>
+          <w:color w:val="DFE8F2"/>
+        </w:rPr>
+        <w:t xml:space="preserve">  pub approval_requirements: Vec&lt;ApprovalRequirement&gt;,</w:t>
+      </w:r>
+    </w:p>
+    <w:p>
+      <w:pPr/>
+      <w:r>
+        <w:rPr>
+          <w:rFonts w:ascii="Menlo" w:hAnsi="Menlo" w:cs="Menlo"/>
+          <w:sz w:val="24"/>
+          <w:sz-cs w:val="24"/>
+          <w:spacing w:val="0"/>
+          <w:color w:val="DFE8F2"/>
+        </w:rPr>
+        <w:t xml:space="preserve">}</w:t>
+      </w:r>
+    </w:p>
+    <w:p>
+      <w:pPr/>
+      <w:r>
+        <w:rPr>
+          <w:rFonts w:ascii="Menlo" w:hAnsi="Menlo" w:cs="Menlo"/>
+          <w:sz w:val="24"/>
+          <w:sz-cs w:val="24"/>
+          <w:spacing w:val="0"/>
+          <w:color w:val="DFE8F2"/>
+        </w:rPr>
+        <w:t xml:space="preserve"/>
+      </w:r>
+    </w:p>
+    <w:p>
+      <w:pPr/>
+      <w:r>
+        <w:rPr>
+          <w:rFonts w:ascii="Menlo" w:hAnsi="Menlo" w:cs="Menlo"/>
+          <w:sz w:val="24"/>
+          <w:sz-cs w:val="24"/>
+          <w:spacing w:val="0"/>
+          <w:color w:val="DFE8F2"/>
+        </w:rPr>
+        <w:t xml:space="preserve">pub struct LifecycleRecord {</w:t>
+      </w:r>
+    </w:p>
+    <w:p>
+      <w:pPr/>
+      <w:r>
+        <w:rPr>
+          <w:rFonts w:ascii="Menlo" w:hAnsi="Menlo" w:cs="Menlo"/>
+          <w:sz w:val="24"/>
+          <w:sz-cs w:val="24"/>
+          <w:spacing w:val="0"/>
+          <w:color w:val="DFE8F2"/>
+        </w:rPr>
+        <w:t xml:space="preserve">  pub agent_id: String,</w:t>
+      </w:r>
+    </w:p>
+    <w:p>
+      <w:pPr/>
+      <w:r>
+        <w:rPr>
+          <w:rFonts w:ascii="Menlo" w:hAnsi="Menlo" w:cs="Menlo"/>
+          <w:sz w:val="24"/>
+          <w:sz-cs w:val="24"/>
+          <w:spacing w:val="0"/>
+          <w:color w:val="DFE8F2"/>
+        </w:rPr>
+        <w:t xml:space="preserve">  pub desired_state: AgentState,</w:t>
+      </w:r>
+    </w:p>
+    <w:p>
+      <w:pPr/>
+      <w:r>
+        <w:rPr>
+          <w:rFonts w:ascii="Menlo" w:hAnsi="Menlo" w:cs="Menlo"/>
+          <w:sz w:val="24"/>
+          <w:sz-cs w:val="24"/>
+          <w:spacing w:val="0"/>
+          <w:color w:val="DFE8F2"/>
+        </w:rPr>
+        <w:t xml:space="preserve">  pub observed_state: AgentState,</w:t>
+      </w:r>
+    </w:p>
+    <w:p>
+      <w:pPr/>
+      <w:r>
+        <w:rPr>
+          <w:rFonts w:ascii="Menlo" w:hAnsi="Menlo" w:cs="Menlo"/>
+          <w:sz w:val="24"/>
+          <w:sz-cs w:val="24"/>
+          <w:spacing w:val="0"/>
+          <w:color w:val="DFE8F2"/>
+        </w:rPr>
+        <w:t xml:space="preserve">  pub health: HealthStatus,</w:t>
+      </w:r>
+    </w:p>
+    <w:p>
+      <w:pPr/>
+      <w:r>
+        <w:rPr>
+          <w:rFonts w:ascii="Menlo" w:hAnsi="Menlo" w:cs="Menlo"/>
+          <w:sz w:val="24"/>
+          <w:sz-cs w:val="24"/>
+          <w:spacing w:val="0"/>
+          <w:color w:val="DFE8F2"/>
+        </w:rPr>
+        <w:t xml:space="preserve">  pub transition_reason: Option&lt;String&gt;,</w:t>
+      </w:r>
+    </w:p>
+    <w:p>
+      <w:pPr/>
+      <w:r>
+        <w:rPr>
+          <w:rFonts w:ascii="Menlo" w:hAnsi="Menlo" w:cs="Menlo"/>
+          <w:sz w:val="24"/>
+          <w:sz-cs w:val="24"/>
+          <w:spacing w:val="0"/>
+          <w:color w:val="DFE8F2"/>
+        </w:rPr>
+        <w:t xml:space="preserve">  pub last_transition_at: String,</w:t>
+      </w:r>
+    </w:p>
+    <w:p>
+      <w:pPr/>
+      <w:r>
+        <w:rPr>
+          <w:rFonts w:ascii="Menlo" w:hAnsi="Menlo" w:cs="Menlo"/>
+          <w:sz w:val="24"/>
+          <w:sz-cs w:val="24"/>
+          <w:spacing w:val="0"/>
+          <w:color w:val="DFE8F2"/>
+        </w:rPr>
+        <w:t xml:space="preserve">  pub degradation_profile: Option&lt;DegradedProfileName&gt;,</w:t>
+      </w:r>
+    </w:p>
+    <w:p>
+      <w:pPr/>
+      <w:r>
+        <w:rPr>
+          <w:rFonts w:ascii="Menlo" w:hAnsi="Menlo" w:cs="Menlo"/>
+          <w:sz w:val="24"/>
+          <w:sz-cs w:val="24"/>
+          <w:spacing w:val="0"/>
+          <w:color w:val="DFE8F2"/>
+        </w:rPr>
+        <w:t xml:space="preserve">  pub continuity_mode: Option&lt;ContinuityModeName&gt;,</w:t>
+      </w:r>
+    </w:p>
+    <w:p>
+      <w:pPr/>
+      <w:r>
+        <w:rPr>
+          <w:rFonts w:ascii="Menlo" w:hAnsi="Menlo" w:cs="Menlo"/>
+          <w:sz w:val="24"/>
+          <w:sz-cs w:val="24"/>
+          <w:spacing w:val="0"/>
+          <w:color w:val="DFE8F2"/>
+        </w:rPr>
+        <w:t xml:space="preserve">  pub failure_count: u32,</w:t>
+      </w:r>
+    </w:p>
+    <w:p>
+      <w:pPr/>
+      <w:r>
+        <w:rPr>
+          <w:rFonts w:ascii="Menlo" w:hAnsi="Menlo" w:cs="Menlo"/>
+          <w:sz w:val="24"/>
+          <w:sz-cs w:val="24"/>
+          <w:spacing w:val="0"/>
+          <w:color w:val="DFE8F2"/>
+        </w:rPr>
+        <w:t xml:space="preserve">}</w:t>
+      </w:r>
+    </w:p>
+    <w:p>
+      <w:pPr/>
+      <w:r>
+        <w:rPr>
+          <w:rFonts w:ascii="Menlo" w:hAnsi="Menlo" w:cs="Menlo"/>
+          <w:sz w:val="24"/>
+          <w:sz-cs w:val="24"/>
+          <w:spacing w:val="0"/>
+          <w:color w:val="DFE8F2"/>
+        </w:rPr>
+        <w:t xml:space="preserve"/>
+      </w:r>
+    </w:p>
+    <w:p>
+      <w:pPr/>
+      <w:r>
+        <w:rPr>
+          <w:rFonts w:ascii="Menlo" w:hAnsi="Menlo" w:cs="Menlo"/>
+          <w:sz w:val="24"/>
+          <w:sz-cs w:val="24"/>
+          <w:spacing w:val="0"/>
+          <w:color w:val="DFE8F2"/>
+        </w:rPr>
+        <w:t xml:space="preserve">pub struct EncounterRecord {</w:t>
+      </w:r>
+    </w:p>
+    <w:p>
+      <w:pPr/>
+      <w:r>
+        <w:rPr>
+          <w:rFonts w:ascii="Menlo" w:hAnsi="Menlo" w:cs="Menlo"/>
+          <w:sz w:val="24"/>
+          <w:sz-cs w:val="24"/>
+          <w:spacing w:val="0"/>
+          <w:color w:val="DFE8F2"/>
+        </w:rPr>
+        <w:t xml:space="preserve">  pub id: String,</w:t>
+      </w:r>
+    </w:p>
+    <w:p>
+      <w:pPr/>
+      <w:r>
+        <w:rPr>
+          <w:rFonts w:ascii="Menlo" w:hAnsi="Menlo" w:cs="Menlo"/>
+          <w:sz w:val="24"/>
+          <w:sz-cs w:val="24"/>
+          <w:spacing w:val="0"/>
+          <w:color w:val="DFE8F2"/>
+        </w:rPr>
+        <w:t xml:space="preserve">  pub initiator_ref: CounterpartyRef,</w:t>
+      </w:r>
+    </w:p>
+    <w:p>
+      <w:pPr/>
+      <w:r>
+        <w:rPr>
+          <w:rFonts w:ascii="Menlo" w:hAnsi="Menlo" w:cs="Menlo"/>
+          <w:sz w:val="24"/>
+          <w:sz-cs w:val="24"/>
+          <w:spacing w:val="0"/>
+          <w:color w:val="DFE8F2"/>
+        </w:rPr>
+        <w:t xml:space="preserve">  pub target_agent_id: String,</w:t>
+      </w:r>
+    </w:p>
+    <w:p>
+      <w:pPr/>
+      <w:r>
+        <w:rPr>
+          <w:rFonts w:ascii="Menlo" w:hAnsi="Menlo" w:cs="Menlo"/>
+          <w:sz w:val="24"/>
+          <w:sz-cs w:val="24"/>
+          <w:spacing w:val="0"/>
+          <w:color w:val="DFE8F2"/>
+        </w:rPr>
+        <w:t xml:space="preserve">  pub target_owner: OwnerRef,</w:t>
+      </w:r>
+    </w:p>
+    <w:p>
+      <w:pPr/>
+      <w:r>
+        <w:rPr>
+          <w:rFonts w:ascii="Menlo" w:hAnsi="Menlo" w:cs="Menlo"/>
+          <w:sz w:val="24"/>
+          <w:sz-cs w:val="24"/>
+          <w:spacing w:val="0"/>
+          <w:color w:val="DFE8F2"/>
+        </w:rPr>
+        <w:t xml:space="preserve">  pub trust_domain: TrustDomain,</w:t>
+      </w:r>
+    </w:p>
+    <w:p>
+      <w:pPr/>
+      <w:r>
+        <w:rPr>
+          <w:rFonts w:ascii="Menlo" w:hAnsi="Menlo" w:cs="Menlo"/>
+          <w:sz w:val="24"/>
+          <w:sz-cs w:val="24"/>
+          <w:spacing w:val="0"/>
+          <w:color w:val="DFE8F2"/>
+        </w:rPr>
+        <w:t xml:space="preserve">  pub requested_capabilities: Vec&lt;String&gt;,</w:t>
+      </w:r>
+    </w:p>
+    <w:p>
+      <w:pPr/>
+      <w:r>
+        <w:rPr>
+          <w:rFonts w:ascii="Menlo" w:hAnsi="Menlo" w:cs="Menlo"/>
+          <w:sz w:val="24"/>
+          <w:sz-cs w:val="24"/>
+          <w:spacing w:val="0"/>
+          <w:color w:val="DFE8F2"/>
+        </w:rPr>
+        <w:t xml:space="preserve">  pub applied_policy_source: String,</w:t>
+      </w:r>
+    </w:p>
+    <w:p>
+      <w:pPr/>
+      <w:r>
+        <w:rPr>
+          <w:rFonts w:ascii="Menlo" w:hAnsi="Menlo" w:cs="Menlo"/>
+          <w:sz w:val="24"/>
+          <w:sz-cs w:val="24"/>
+          <w:spacing w:val="0"/>
+          <w:color w:val="DFE8F2"/>
+        </w:rPr>
+        <w:t xml:space="preserve">  pub state: EncounterState,</w:t>
+      </w:r>
+    </w:p>
+    <w:p>
+      <w:pPr/>
+      <w:r>
+        <w:rPr>
+          <w:rFonts w:ascii="Menlo" w:hAnsi="Menlo" w:cs="Menlo"/>
+          <w:sz w:val="24"/>
+          <w:sz-cs w:val="24"/>
+          <w:spacing w:val="0"/>
+          <w:color w:val="DFE8F2"/>
+        </w:rPr>
+        <w:t xml:space="preserve">  pub grant_refs: Vec&lt;String&gt;,</w:t>
+      </w:r>
+    </w:p>
+    <w:p>
+      <w:pPr/>
+      <w:r>
+        <w:rPr>
+          <w:rFonts w:ascii="Menlo" w:hAnsi="Menlo" w:cs="Menlo"/>
+          <w:sz w:val="24"/>
+          <w:sz-cs w:val="24"/>
+          <w:spacing w:val="0"/>
+          <w:color w:val="DFE8F2"/>
+        </w:rPr>
+        <w:t xml:space="preserve">  pub lease_ref: Option&lt;String&gt;,</w:t>
+      </w:r>
+    </w:p>
+    <w:p>
+      <w:pPr/>
+      <w:r>
+        <w:rPr>
+          <w:rFonts w:ascii="Menlo" w:hAnsi="Menlo" w:cs="Menlo"/>
+          <w:sz w:val="24"/>
+          <w:sz-cs w:val="24"/>
+          <w:spacing w:val="0"/>
+          <w:color w:val="DFE8F2"/>
+        </w:rPr>
+        <w:t xml:space="preserve">  pub created_at: String,</w:t>
+      </w:r>
+    </w:p>
+    <w:p>
+      <w:pPr/>
+      <w:r>
+        <w:rPr>
+          <w:rFonts w:ascii="Menlo" w:hAnsi="Menlo" w:cs="Menlo"/>
+          <w:sz w:val="24"/>
+          <w:sz-cs w:val="24"/>
+          <w:spacing w:val="0"/>
+          <w:color w:val="DFE8F2"/>
+        </w:rPr>
+        <w:t xml:space="preserve">}</w:t>
+      </w:r>
+    </w:p>
+    <w:p>
+      <w:pPr/>
+      <w:r>
+        <w:rPr>
+          <w:rFonts w:ascii="Menlo" w:hAnsi="Menlo" w:cs="Menlo"/>
+          <w:sz w:val="24"/>
+          <w:sz-cs w:val="24"/>
+          <w:spacing w:val="0"/>
+          <w:color w:val="DFE8F2"/>
+        </w:rPr>
+        <w:t xml:space="preserve"/>
+      </w:r>
+    </w:p>
+    <w:p>
+      <w:pPr/>
+      <w:r>
+        <w:rPr>
+          <w:rFonts w:ascii="Menlo" w:hAnsi="Menlo" w:cs="Menlo"/>
+          <w:sz w:val="24"/>
+          <w:sz-cs w:val="24"/>
+          <w:spacing w:val="0"/>
+          <w:color w:val="DFE8F2"/>
+        </w:rPr>
+        <w:t xml:space="preserve">pub struct ConsentGrant {</w:t>
+      </w:r>
+    </w:p>
+    <w:p>
+      <w:pPr/>
+      <w:r>
+        <w:rPr>
+          <w:rFonts w:ascii="Menlo" w:hAnsi="Menlo" w:cs="Menlo"/>
+          <w:sz w:val="24"/>
+          <w:sz-cs w:val="24"/>
+          <w:spacing w:val="0"/>
+          <w:color w:val="DFE8F2"/>
+        </w:rPr>
+        <w:t xml:space="preserve">  pub id: String,</w:t>
+      </w:r>
+    </w:p>
+    <w:p>
+      <w:pPr/>
+      <w:r>
+        <w:rPr>
+          <w:rFonts w:ascii="Menlo" w:hAnsi="Menlo" w:cs="Menlo"/>
+          <w:sz w:val="24"/>
+          <w:sz-cs w:val="24"/>
+          <w:spacing w:val="0"/>
+          <w:color w:val="DFE8F2"/>
+        </w:rPr>
+        <w:t xml:space="preserve">  pub grantor: OwnerRef,</w:t>
+      </w:r>
+    </w:p>
+    <w:p>
+      <w:pPr/>
+      <w:r>
+        <w:rPr>
+          <w:rFonts w:ascii="Menlo" w:hAnsi="Menlo" w:cs="Menlo"/>
+          <w:sz w:val="24"/>
+          <w:sz-cs w:val="24"/>
+          <w:spacing w:val="0"/>
+          <w:color w:val="DFE8F2"/>
+        </w:rPr>
+        <w:t xml:space="preserve">  pub grantee: OwnerRef,</w:t>
+      </w:r>
+    </w:p>
+    <w:p>
+      <w:pPr/>
+      <w:r>
+        <w:rPr>
+          <w:rFonts w:ascii="Menlo" w:hAnsi="Menlo" w:cs="Menlo"/>
+          <w:sz w:val="24"/>
+          <w:sz-cs w:val="24"/>
+          <w:spacing w:val="0"/>
+          <w:color w:val="DFE8F2"/>
+        </w:rPr>
+        <w:t xml:space="preserve">  pub purpose: String,</w:t>
+      </w:r>
+    </w:p>
+    <w:p>
+      <w:pPr/>
+      <w:r>
+        <w:rPr>
+          <w:rFonts w:ascii="Menlo" w:hAnsi="Menlo" w:cs="Menlo"/>
+          <w:sz w:val="24"/>
+          <w:sz-cs w:val="24"/>
+          <w:spacing w:val="0"/>
+          <w:color w:val="DFE8F2"/>
+        </w:rPr>
+        <w:t xml:space="preserve">  pub scope: Vec&lt;String&gt;,</w:t>
+      </w:r>
+    </w:p>
+    <w:p>
+      <w:pPr/>
+      <w:r>
+        <w:rPr>
+          <w:rFonts w:ascii="Menlo" w:hAnsi="Menlo" w:cs="Menlo"/>
+          <w:sz w:val="24"/>
+          <w:sz-cs w:val="24"/>
+          <w:spacing w:val="0"/>
+          <w:color w:val="DFE8F2"/>
+        </w:rPr>
+        <w:t xml:space="preserve">  pub issued_at: String,</w:t>
+      </w:r>
+    </w:p>
+    <w:p>
+      <w:pPr/>
+      <w:r>
+        <w:rPr>
+          <w:rFonts w:ascii="Menlo" w:hAnsi="Menlo" w:cs="Menlo"/>
+          <w:sz w:val="24"/>
+          <w:sz-cs w:val="24"/>
+          <w:spacing w:val="0"/>
+          <w:color w:val="DFE8F2"/>
+        </w:rPr>
+        <w:t xml:space="preserve">  pub expires_at: String,</w:t>
+      </w:r>
+    </w:p>
+    <w:p>
+      <w:pPr/>
+      <w:r>
+        <w:rPr>
+          <w:rFonts w:ascii="Menlo" w:hAnsi="Menlo" w:cs="Menlo"/>
+          <w:sz w:val="24"/>
+          <w:sz-cs w:val="24"/>
+          <w:spacing w:val="0"/>
+          <w:color w:val="DFE8F2"/>
+        </w:rPr>
+        <w:t xml:space="preserve">  pub revocable: bool,</w:t>
+      </w:r>
+    </w:p>
+    <w:p>
+      <w:pPr/>
+      <w:r>
+        <w:rPr>
+          <w:rFonts w:ascii="Menlo" w:hAnsi="Menlo" w:cs="Menlo"/>
+          <w:sz w:val="24"/>
+          <w:sz-cs w:val="24"/>
+          <w:spacing w:val="0"/>
+          <w:color w:val="DFE8F2"/>
+        </w:rPr>
+        <w:t xml:space="preserve">  pub approver_ref: Option&lt;String&gt;,</w:t>
+      </w:r>
+    </w:p>
+    <w:p>
+      <w:pPr/>
+      <w:r>
+        <w:rPr>
+          <w:rFonts w:ascii="Menlo" w:hAnsi="Menlo" w:cs="Menlo"/>
+          <w:sz w:val="24"/>
+          <w:sz-cs w:val="24"/>
+          <w:spacing w:val="0"/>
+          <w:color w:val="DFE8F2"/>
+        </w:rPr>
+        <w:t xml:space="preserve">}</w:t>
+      </w:r>
+    </w:p>
+    <w:p>
+      <w:pPr/>
+      <w:r>
+        <w:rPr>
+          <w:rFonts w:ascii="Menlo" w:hAnsi="Menlo" w:cs="Menlo"/>
+          <w:sz w:val="24"/>
+          <w:sz-cs w:val="24"/>
+          <w:spacing w:val="0"/>
+          <w:color w:val="DFE8F2"/>
+        </w:rPr>
+        <w:t xml:space="preserve"/>
+      </w:r>
+    </w:p>
+    <w:p>
+      <w:pPr/>
+      <w:r>
+        <w:rPr>
+          <w:rFonts w:ascii="Menlo" w:hAnsi="Menlo" w:cs="Menlo"/>
+          <w:sz w:val="24"/>
+          <w:sz-cs w:val="24"/>
+          <w:spacing w:val="0"/>
+          <w:color w:val="DFE8F2"/>
+        </w:rPr>
+        <w:t xml:space="preserve">pub struct CapabilityLease {</w:t>
+      </w:r>
+    </w:p>
+    <w:p>
+      <w:pPr/>
+      <w:r>
+        <w:rPr>
+          <w:rFonts w:ascii="Menlo" w:hAnsi="Menlo" w:cs="Menlo"/>
+          <w:sz w:val="24"/>
+          <w:sz-cs w:val="24"/>
+          <w:spacing w:val="0"/>
+          <w:color w:val="DFE8F2"/>
+        </w:rPr>
+        <w:t xml:space="preserve">  pub id: String,</w:t>
+      </w:r>
+    </w:p>
+    <w:p>
+      <w:pPr/>
+      <w:r>
+        <w:rPr>
+          <w:rFonts w:ascii="Menlo" w:hAnsi="Menlo" w:cs="Menlo"/>
+          <w:sz w:val="24"/>
+          <w:sz-cs w:val="24"/>
+          <w:spacing w:val="0"/>
+          <w:color w:val="DFE8F2"/>
+        </w:rPr>
+        <w:t xml:space="preserve">  pub grant_ref: String,</w:t>
+      </w:r>
+    </w:p>
+    <w:p>
+      <w:pPr/>
+      <w:r>
+        <w:rPr>
+          <w:rFonts w:ascii="Menlo" w:hAnsi="Menlo" w:cs="Menlo"/>
+          <w:sz w:val="24"/>
+          <w:sz-cs w:val="24"/>
+          <w:spacing w:val="0"/>
+          <w:color w:val="DFE8F2"/>
+        </w:rPr>
+        <w:t xml:space="preserve">  pub lessor: OwnerRef,</w:t>
+      </w:r>
+    </w:p>
+    <w:p>
+      <w:pPr/>
+      <w:r>
+        <w:rPr>
+          <w:rFonts w:ascii="Menlo" w:hAnsi="Menlo" w:cs="Menlo"/>
+          <w:sz w:val="24"/>
+          <w:sz-cs w:val="24"/>
+          <w:spacing w:val="0"/>
+          <w:color w:val="DFE8F2"/>
+        </w:rPr>
+        <w:t xml:space="preserve">  pub lessee: OwnerRef,</w:t>
+      </w:r>
+    </w:p>
+    <w:p>
+      <w:pPr/>
+      <w:r>
+        <w:rPr>
+          <w:rFonts w:ascii="Menlo" w:hAnsi="Menlo" w:cs="Menlo"/>
+          <w:sz w:val="24"/>
+          <w:sz-cs w:val="24"/>
+          <w:spacing w:val="0"/>
+          <w:color w:val="DFE8F2"/>
+        </w:rPr>
+        <w:t xml:space="preserve">  pub capability_refs: Vec&lt;String&gt;,</w:t>
+      </w:r>
+    </w:p>
+    <w:p>
+      <w:pPr/>
+      <w:r>
+        <w:rPr>
+          <w:rFonts w:ascii="Menlo" w:hAnsi="Menlo" w:cs="Menlo"/>
+          <w:sz w:val="24"/>
+          <w:sz-cs w:val="24"/>
+          <w:spacing w:val="0"/>
+          <w:color w:val="DFE8F2"/>
+        </w:rPr>
+        <w:t xml:space="preserve">  pub scope: Vec&lt;String&gt;,</w:t>
+      </w:r>
+    </w:p>
+    <w:p>
+      <w:pPr/>
+      <w:r>
+        <w:rPr>
+          <w:rFonts w:ascii="Menlo" w:hAnsi="Menlo" w:cs="Menlo"/>
+          <w:sz w:val="24"/>
+          <w:sz-cs w:val="24"/>
+          <w:spacing w:val="0"/>
+          <w:color w:val="DFE8F2"/>
+        </w:rPr>
+        <w:t xml:space="preserve">  pub issued_at: String,</w:t>
+      </w:r>
+    </w:p>
+    <w:p>
+      <w:pPr/>
+      <w:r>
+        <w:rPr>
+          <w:rFonts w:ascii="Menlo" w:hAnsi="Menlo" w:cs="Menlo"/>
+          <w:sz w:val="24"/>
+          <w:sz-cs w:val="24"/>
+          <w:spacing w:val="0"/>
+          <w:color w:val="DFE8F2"/>
+        </w:rPr>
+        <w:t xml:space="preserve">  pub expires_at: String,</w:t>
+      </w:r>
+    </w:p>
+    <w:p>
+      <w:pPr/>
+      <w:r>
+        <w:rPr>
+          <w:rFonts w:ascii="Menlo" w:hAnsi="Menlo" w:cs="Menlo"/>
+          <w:sz w:val="24"/>
+          <w:sz-cs w:val="24"/>
+          <w:spacing w:val="0"/>
+          <w:color w:val="DFE8F2"/>
+        </w:rPr>
+        <w:t xml:space="preserve">  pub revocation_reason: Option&lt;String&gt;,</w:t>
+      </w:r>
+    </w:p>
+    <w:p>
+      <w:pPr/>
+      <w:r>
+        <w:rPr>
+          <w:rFonts w:ascii="Menlo" w:hAnsi="Menlo" w:cs="Menlo"/>
+          <w:sz w:val="24"/>
+          <w:sz-cs w:val="24"/>
+          <w:spacing w:val="0"/>
+          <w:color w:val="DFE8F2"/>
+        </w:rPr>
+        <w:t xml:space="preserve">  pub audit_receipt_ref: String,</w:t>
+      </w:r>
+    </w:p>
+    <w:p>
+      <w:pPr/>
+      <w:r>
+        <w:rPr>
+          <w:rFonts w:ascii="Menlo" w:hAnsi="Menlo" w:cs="Menlo"/>
+          <w:sz w:val="24"/>
+          <w:sz-cs w:val="24"/>
+          <w:spacing w:val="0"/>
+          <w:color w:val="DFE8F2"/>
+        </w:rPr>
+        <w:t xml:space="preserve">}</w:t>
+      </w:r>
+    </w:p>
+    <w:p>
+      <w:pPr/>
+      <w:r>
+        <w:rPr>
+          <w:rFonts w:ascii="Menlo" w:hAnsi="Menlo" w:cs="Menlo"/>
+          <w:sz w:val="24"/>
+          <w:sz-cs w:val="24"/>
+          <w:spacing w:val="0"/>
+          <w:color w:val="DFE8F2"/>
+        </w:rPr>
+        <w:t xml:space="preserve"/>
+      </w:r>
+    </w:p>
+    <w:p>
+      <w:pPr/>
+      <w:r>
+        <w:rPr>
+          <w:rFonts w:ascii="Menlo" w:hAnsi="Menlo" w:cs="Menlo"/>
+          <w:sz w:val="24"/>
+          <w:sz-cs w:val="24"/>
+          <w:spacing w:val="0"/>
+          <w:color w:val="DFE8F2"/>
+        </w:rPr>
+        <w:t xml:space="preserve">pub struct AuditReceipt {</w:t>
+      </w:r>
+    </w:p>
+    <w:p>
+      <w:pPr/>
+      <w:r>
+        <w:rPr>
+          <w:rFonts w:ascii="Menlo" w:hAnsi="Menlo" w:cs="Menlo"/>
+          <w:sz w:val="24"/>
+          <w:sz-cs w:val="24"/>
+          <w:spacing w:val="0"/>
+          <w:color w:val="DFE8F2"/>
+        </w:rPr>
+        <w:t xml:space="preserve">  pub id: String,</w:t>
+      </w:r>
+    </w:p>
+    <w:p>
+      <w:pPr/>
+      <w:r>
+        <w:rPr>
+          <w:rFonts w:ascii="Menlo" w:hAnsi="Menlo" w:cs="Menlo"/>
+          <w:sz w:val="24"/>
+          <w:sz-cs w:val="24"/>
+          <w:spacing w:val="0"/>
+          <w:color w:val="DFE8F2"/>
+        </w:rPr>
+        <w:t xml:space="preserve">  pub encounter_ref: String,</w:t>
+      </w:r>
+    </w:p>
+    <w:p>
+      <w:pPr/>
+      <w:r>
+        <w:rPr>
+          <w:rFonts w:ascii="Menlo" w:hAnsi="Menlo" w:cs="Menlo"/>
+          <w:sz w:val="24"/>
+          <w:sz-cs w:val="24"/>
+          <w:spacing w:val="0"/>
+          <w:color w:val="DFE8F2"/>
+        </w:rPr>
+        <w:t xml:space="preserve">  pub grant_refs: Vec&lt;String&gt;,</w:t>
+      </w:r>
+    </w:p>
+    <w:p>
+      <w:pPr/>
+      <w:r>
+        <w:rPr>
+          <w:rFonts w:ascii="Menlo" w:hAnsi="Menlo" w:cs="Menlo"/>
+          <w:sz w:val="24"/>
+          <w:sz-cs w:val="24"/>
+          <w:spacing w:val="0"/>
+          <w:color w:val="DFE8F2"/>
+        </w:rPr>
+        <w:t xml:space="preserve">  pub lease_ref: Option&lt;String&gt;,</w:t>
+      </w:r>
+    </w:p>
+    <w:p>
+      <w:pPr/>
+      <w:r>
+        <w:rPr>
+          <w:rFonts w:ascii="Menlo" w:hAnsi="Menlo" w:cs="Menlo"/>
+          <w:sz w:val="24"/>
+          <w:sz-cs w:val="24"/>
+          <w:spacing w:val="0"/>
+          <w:color w:val="DFE8F2"/>
+        </w:rPr>
+        <w:t xml:space="preserve">  pub outcome: AuditOutcome,</w:t>
+      </w:r>
+    </w:p>
+    <w:p>
+      <w:pPr/>
+      <w:r>
+        <w:rPr>
+          <w:rFonts w:ascii="Menlo" w:hAnsi="Menlo" w:cs="Menlo"/>
+          <w:sz w:val="24"/>
+          <w:sz-cs w:val="24"/>
+          <w:spacing w:val="0"/>
+          <w:color w:val="DFE8F2"/>
+        </w:rPr>
+        <w:t xml:space="preserve">  pub reason: String,</w:t>
+      </w:r>
+    </w:p>
+    <w:p>
+      <w:pPr/>
+      <w:r>
+        <w:rPr>
+          <w:rFonts w:ascii="Menlo" w:hAnsi="Menlo" w:cs="Menlo"/>
+          <w:sz w:val="24"/>
+          <w:sz-cs w:val="24"/>
+          <w:spacing w:val="0"/>
+          <w:color w:val="DFE8F2"/>
+        </w:rPr>
+        <w:t xml:space="preserve">  pub approver_ref: Option&lt;String&gt;,</w:t>
+      </w:r>
+    </w:p>
+    <w:p>
+      <w:pPr/>
+      <w:r>
+        <w:rPr>
+          <w:rFonts w:ascii="Menlo" w:hAnsi="Menlo" w:cs="Menlo"/>
+          <w:sz w:val="24"/>
+          <w:sz-cs w:val="24"/>
+          <w:spacing w:val="0"/>
+          <w:color w:val="DFE8F2"/>
+        </w:rPr>
+        <w:t xml:space="preserve">  pub emitted_at: String,</w:t>
+      </w:r>
+    </w:p>
+    <w:p>
+      <w:pPr/>
+      <w:r>
+        <w:rPr>
+          <w:rFonts w:ascii="Menlo" w:hAnsi="Menlo" w:cs="Menlo"/>
+          <w:sz w:val="24"/>
+          <w:sz-cs w:val="24"/>
+          <w:spacing w:val="0"/>
+          <w:color w:val="DFE8F2"/>
+        </w:rPr>
+        <w:t xml:space="preserve">}</w:t>
       </w:r>
     </w:p>
     <w:p>
@@ -13459,150 +13637,163 @@
           <w:spacing w:val="0"/>
           <w:color w:val="DFE8F2"/>
         </w:rPr>
-        <w:t xml:space="preserve">type RuntimeProfile = {</w:t>
-      </w:r>
-    </w:p>
-    <w:p>
-      <w:pPr/>
-      <w:r>
-        <w:rPr>
-          <w:rFonts w:ascii="Menlo" w:hAnsi="Menlo" w:cs="Menlo"/>
-          <w:sz w:val="24"/>
-          <w:sz-cs w:val="24"/>
-          <w:spacing w:val="0"/>
-          <w:color w:val="DFE8F2"/>
-        </w:rPr>
-        <w:t xml:space="preserve">  concurrency_group: "exclusive" | "reentrant";</w:t>
-      </w:r>
-    </w:p>
-    <w:p>
-      <w:pPr/>
-      <w:r>
-        <w:rPr>
-          <w:rFonts w:ascii="Menlo" w:hAnsi="Menlo" w:cs="Menlo"/>
-          <w:sz w:val="24"/>
-          <w:sz-cs w:val="24"/>
-          <w:spacing w:val="0"/>
-          <w:color w:val="DFE8F2"/>
-        </w:rPr>
-        <w:t xml:space="preserve">  max_parallel_actions: number;</w:t>
-      </w:r>
-    </w:p>
-    <w:p>
-      <w:pPr/>
-      <w:r>
-        <w:rPr>
-          <w:rFonts w:ascii="Menlo" w:hAnsi="Menlo" w:cs="Menlo"/>
-          <w:sz w:val="24"/>
-          <w:sz-cs w:val="24"/>
-          <w:spacing w:val="0"/>
-          <w:color w:val="DFE8F2"/>
-        </w:rPr>
-        <w:t xml:space="preserve">  memory_scope: "ephemeral" | "session" | "workspace";</w:t>
-      </w:r>
-    </w:p>
-    <w:p>
-      <w:pPr/>
-      <w:r>
-        <w:rPr>
-          <w:rFonts w:ascii="Menlo" w:hAnsi="Menlo" w:cs="Menlo"/>
-          <w:sz w:val="24"/>
-          <w:sz-cs w:val="24"/>
-          <w:spacing w:val="0"/>
-          <w:color w:val="DFE8F2"/>
-        </w:rPr>
-        <w:t xml:space="preserve">};</w:t>
-      </w:r>
-    </w:p>
-    <w:p>
-      <w:pPr/>
-      <w:r>
-        <w:rPr>
-          <w:rFonts w:ascii="Menlo" w:hAnsi="Menlo" w:cs="Menlo"/>
-          <w:sz w:val="24"/>
-          <w:sz-cs w:val="24"/>
-          <w:spacing w:val="0"/>
-          <w:color w:val="DFE8F2"/>
-        </w:rPr>
-        <w:t xml:space="preserve"/>
-      </w:r>
-    </w:p>
-    <w:p>
-      <w:pPr/>
-      <w:r>
-        <w:rPr>
-          <w:rFonts w:ascii="Menlo" w:hAnsi="Menlo" w:cs="Menlo"/>
-          <w:sz w:val="24"/>
-          <w:sz-cs w:val="24"/>
-          <w:spacing w:val="0"/>
-          <w:color w:val="DFE8F2"/>
-        </w:rPr>
-        <w:t xml:space="preserve">type TrustDomain =</w:t>
-      </w:r>
-    </w:p>
-    <w:p>
-      <w:pPr/>
-      <w:r>
-        <w:rPr>
-          <w:rFonts w:ascii="Menlo" w:hAnsi="Menlo" w:cs="Menlo"/>
-          <w:sz w:val="24"/>
-          <w:sz-cs w:val="24"/>
-          <w:spacing w:val="0"/>
-          <w:color w:val="DFE8F2"/>
-        </w:rPr>
-        <w:t xml:space="preserve">  | "same_owner_local"</w:t>
-      </w:r>
-    </w:p>
-    <w:p>
-      <w:pPr/>
-      <w:r>
-        <w:rPr>
-          <w:rFonts w:ascii="Menlo" w:hAnsi="Menlo" w:cs="Menlo"/>
-          <w:sz w:val="24"/>
-          <w:sz-cs w:val="24"/>
-          <w:spacing w:val="0"/>
-          <w:color w:val="DFE8F2"/>
-        </w:rPr>
-        <w:t xml:space="preserve">  | "same_device_foreign_owner"</w:t>
-      </w:r>
-    </w:p>
-    <w:p>
-      <w:pPr/>
-      <w:r>
-        <w:rPr>
-          <w:rFonts w:ascii="Menlo" w:hAnsi="Menlo" w:cs="Menlo"/>
-          <w:sz w:val="24"/>
-          <w:sz-cs w:val="24"/>
-          <w:spacing w:val="0"/>
-          <w:color w:val="DFE8F2"/>
-        </w:rPr>
-        <w:t xml:space="preserve">  | "internal_org"</w:t>
-      </w:r>
-    </w:p>
-    <w:p>
-      <w:pPr/>
-      <w:r>
-        <w:rPr>
-          <w:rFonts w:ascii="Menlo" w:hAnsi="Menlo" w:cs="Menlo"/>
-          <w:sz w:val="24"/>
-          <w:sz-cs w:val="24"/>
-          <w:spacing w:val="0"/>
-          <w:color w:val="DFE8F2"/>
-        </w:rPr>
-        <w:t xml:space="preserve">  | "external_partner"</w:t>
-      </w:r>
-    </w:p>
-    <w:p>
-      <w:pPr/>
-      <w:r>
-        <w:rPr>
-          <w:rFonts w:ascii="Menlo" w:hAnsi="Menlo" w:cs="Menlo"/>
-          <w:sz w:val="24"/>
-          <w:sz-cs w:val="24"/>
-          <w:spacing w:val="0"/>
-          <w:color w:val="DFE8F2"/>
-        </w:rPr>
-        <w:t xml:space="preserve">  | "public_unknown";</w:t>
+        <w:t xml:space="preserve">pub struct RuntimeProfile {</w:t>
+      </w:r>
+    </w:p>
+    <w:p>
+      <w:pPr/>
+      <w:r>
+        <w:rPr>
+          <w:rFonts w:ascii="Menlo" w:hAnsi="Menlo" w:cs="Menlo"/>
+          <w:sz w:val="24"/>
+          <w:sz-cs w:val="24"/>
+          <w:spacing w:val="0"/>
+          <w:color w:val="DFE8F2"/>
+        </w:rPr>
+        <w:t xml:space="preserve">  pub concurrency_group: ConcurrencyGroup,</w:t>
+      </w:r>
+    </w:p>
+    <w:p>
+      <w:pPr/>
+      <w:r>
+        <w:rPr>
+          <w:rFonts w:ascii="Menlo" w:hAnsi="Menlo" w:cs="Menlo"/>
+          <w:sz w:val="24"/>
+          <w:sz-cs w:val="24"/>
+          <w:spacing w:val="0"/>
+          <w:color w:val="DFE8F2"/>
+        </w:rPr>
+        <w:t xml:space="preserve">  pub max_parallel_actions: u32,</w:t>
+      </w:r>
+    </w:p>
+    <w:p>
+      <w:pPr/>
+      <w:r>
+        <w:rPr>
+          <w:rFonts w:ascii="Menlo" w:hAnsi="Menlo" w:cs="Menlo"/>
+          <w:sz w:val="24"/>
+          <w:sz-cs w:val="24"/>
+          <w:spacing w:val="0"/>
+          <w:color w:val="DFE8F2"/>
+        </w:rPr>
+        <w:t xml:space="preserve">  pub memory_scope: MemoryScope,</w:t>
+      </w:r>
+    </w:p>
+    <w:p>
+      <w:pPr/>
+      <w:r>
+        <w:rPr>
+          <w:rFonts w:ascii="Menlo" w:hAnsi="Menlo" w:cs="Menlo"/>
+          <w:sz w:val="24"/>
+          <w:sz-cs w:val="24"/>
+          <w:spacing w:val="0"/>
+          <w:color w:val="DFE8F2"/>
+        </w:rPr>
+        <w:t xml:space="preserve">}</w:t>
+      </w:r>
+    </w:p>
+    <w:p>
+      <w:pPr/>
+      <w:r>
+        <w:rPr>
+          <w:rFonts w:ascii="Menlo" w:hAnsi="Menlo" w:cs="Menlo"/>
+          <w:sz w:val="24"/>
+          <w:sz-cs w:val="24"/>
+          <w:spacing w:val="0"/>
+          <w:color w:val="DFE8F2"/>
+        </w:rPr>
+        <w:t xml:space="preserve"/>
+      </w:r>
+    </w:p>
+    <w:p>
+      <w:pPr/>
+      <w:r>
+        <w:rPr>
+          <w:rFonts w:ascii="Menlo" w:hAnsi="Menlo" w:cs="Menlo"/>
+          <w:sz w:val="24"/>
+          <w:sz-cs w:val="24"/>
+          <w:spacing w:val="0"/>
+          <w:color w:val="DFE8F2"/>
+        </w:rPr>
+        <w:t xml:space="preserve">pub enum TrustDomain {</w:t>
+      </w:r>
+    </w:p>
+    <w:p>
+      <w:pPr/>
+      <w:r>
+        <w:rPr>
+          <w:rFonts w:ascii="Menlo" w:hAnsi="Menlo" w:cs="Menlo"/>
+          <w:sz w:val="24"/>
+          <w:sz-cs w:val="24"/>
+          <w:spacing w:val="0"/>
+          <w:color w:val="DFE8F2"/>
+        </w:rPr>
+        <w:t xml:space="preserve">  SameOwnerLocal,</w:t>
+      </w:r>
+    </w:p>
+    <w:p>
+      <w:pPr/>
+      <w:r>
+        <w:rPr>
+          <w:rFonts w:ascii="Menlo" w:hAnsi="Menlo" w:cs="Menlo"/>
+          <w:sz w:val="24"/>
+          <w:sz-cs w:val="24"/>
+          <w:spacing w:val="0"/>
+          <w:color w:val="DFE8F2"/>
+        </w:rPr>
+        <w:t xml:space="preserve">  SameDeviceForeignOwner,</w:t>
+      </w:r>
+    </w:p>
+    <w:p>
+      <w:pPr/>
+      <w:r>
+        <w:rPr>
+          <w:rFonts w:ascii="Menlo" w:hAnsi="Menlo" w:cs="Menlo"/>
+          <w:sz w:val="24"/>
+          <w:sz-cs w:val="24"/>
+          <w:spacing w:val="0"/>
+          <w:color w:val="DFE8F2"/>
+        </w:rPr>
+        <w:t xml:space="preserve">  InternalOrg,</w:t>
+      </w:r>
+    </w:p>
+    <w:p>
+      <w:pPr/>
+      <w:r>
+        <w:rPr>
+          <w:rFonts w:ascii="Menlo" w:hAnsi="Menlo" w:cs="Menlo"/>
+          <w:sz w:val="24"/>
+          <w:sz-cs w:val="24"/>
+          <w:spacing w:val="0"/>
+          <w:color w:val="DFE8F2"/>
+        </w:rPr>
+        <w:t xml:space="preserve">  ExternalPartner,</w:t>
+      </w:r>
+    </w:p>
+    <w:p>
+      <w:pPr/>
+      <w:r>
+        <w:rPr>
+          <w:rFonts w:ascii="Menlo" w:hAnsi="Menlo" w:cs="Menlo"/>
+          <w:sz w:val="24"/>
+          <w:sz-cs w:val="24"/>
+          <w:spacing w:val="0"/>
+          <w:color w:val="DFE8F2"/>
+        </w:rPr>
+        <w:t xml:space="preserve">  PublicUnknown,</w:t>
+      </w:r>
+    </w:p>
+    <w:p>
+      <w:pPr/>
+      <w:r>
+        <w:rPr>
+          <w:rFonts w:ascii="Menlo" w:hAnsi="Menlo" w:cs="Menlo"/>
+          <w:sz w:val="24"/>
+          <w:sz-cs w:val="24"/>
+          <w:spacing w:val="0"/>
+          <w:color w:val="DFE8F2"/>
+        </w:rPr>
+        <w:t xml:space="preserve">}</w:t>
       </w:r>
     </w:p>
     <w:p>
@@ -29211,7 +29402,7 @@
           <w:spacing w:val="0"/>
           <w:color w:val="181F26"/>
         </w:rPr>
-        <w:t xml:space="preserve">TypeScript</w:t>
+        <w:t xml:space="preserve">Rust</w:t>
       </w:r>
     </w:p>
     <w:p>
@@ -29237,7 +29428,7 @@
           <w:spacing w:val="0"/>
           <w:color w:val="181F26"/>
         </w:rPr>
-        <w:t xml:space="preserve">Node 22+</w:t>
+        <w:t xml:space="preserve">Rust 1.88+</w:t>
       </w:r>
     </w:p>
     <w:p>
@@ -29394,6 +29585,32 @@
           <w:color w:val="181F26"/>
         </w:rPr>
         <w:t xml:space="preserve">OpenClaw bidirectional interop, ACP-compatible harness adapters, and A2A in P1</w:t>
+      </w:r>
+    </w:p>
+    <w:p>
+      <w:pPr/>
+      <w:r>
+        <w:rPr>
+          <w:rFonts w:ascii="Helvetica Neue" w:hAnsi="Helvetica Neue" w:cs="Helvetica Neue"/>
+          <w:sz w:val="26"/>
+          <w:sz-cs w:val="26"/>
+          <w:spacing w:val="0"/>
+          <w:color w:val="181F26"/>
+        </w:rPr>
+        <w:t xml:space="preserve">external adapter boundary</w:t>
+      </w:r>
+    </w:p>
+    <w:p>
+      <w:pPr/>
+      <w:r>
+        <w:rPr>
+          <w:rFonts w:ascii="Helvetica Neue" w:hAnsi="Helvetica Neue" w:cs="Helvetica Neue"/>
+          <w:sz w:val="26"/>
+          <w:sz-cs w:val="26"/>
+          <w:spacing w:val="0"/>
+          <w:color w:val="181F26"/>
+        </w:rPr>
+        <w:t xml:space="preserve">JSON-RPC 2.0 over stdio</w:t>
       </w:r>
     </w:p>
     <w:p>
@@ -30358,6 +30575,21 @@
           <w:color w:val="181F26"/>
         </w:rPr>
         <w:t xml:space="preserve">.</w:t>
+      </w:r>
+    </w:p>
+    <w:p>
+      <w:pPr>
+        <w:spacing w:after="240"/>
+      </w:pPr>
+      <w:r>
+        <w:rPr>
+          <w:rFonts w:ascii="Helvetica Neue" w:hAnsi="Helvetica Neue" w:cs="Helvetica Neue"/>
+          <w:sz w:val="24"/>
+          <w:sz-cs w:val="24"/>
+          <w:spacing w:val="0"/>
+          <w:color w:val="181F26"/>
+        </w:rPr>
+        <w:t xml:space="preserve">Implementation baseline for this alpha is Rust-first: the supervisor daemon, CLI, state machine logic, contract compiler, governance logic, and SQLite persistence live in the Rust workspace. Non-Rust implementations are reserved for future out-of-process adapters behind the adapter boundary.</w:t>
       </w:r>
     </w:p>
     <w:p>

</xml_diff>